<commit_message>
Update App Manual 2025: add Core Capabilities screenshot, expand trajectory docs, fix app entry references
Co-Authored-By: Claude Opus 4.6 (1M context) <noreply@anthropic.com>
</commit_message>
<xml_diff>
--- a/App Manual_2025.docx
+++ b/App Manual_2025.docx
@@ -150,7 +150,7 @@
           <w:color w:val="538135"/>
           <w:sz w:val="48"/>
         </w:rPr>
-        <w:t xml:space="preserve">RF Signal Mapping and Analysis Tool </w:t>
+        <w:t xml:space="preserve">RF Propagation &amp; Trajectory Studio </w:t>
       </w:r>
     </w:p>
     <w:p ns2:paraId="65936FD6" ns2:textId="77777777">
@@ -262,7 +262,7 @@
         <w:ind w:left="-5" w:right="0"/>
       </w:pPr>
       <w:r>
-        <w:t xml:space="preserve">An interactive MATLAB program called </w:t>
+        <w:t>RF Propagation &amp; Trajectory Studio is an interactive MATLAB application for wireless coverage prediction, trajectory simulation, and dataset generation. The integrated GUI (app.m) bundles scenario setup, transmitter/receiver management, coverage visualization, directional antenna design, RRT-based trajectory generation, vehicle kinematics simulation, transformer-based trajectory synthesis, and automated dataset export into a single App Designer interface.</w:t>
       </w:r>
       <w:r>
         <w:rPr>
@@ -357,6 +357,57 @@
       </w:pPr>
       <w:r>
         <w:t xml:space="preserve">The project offers a thorough and user-friendly framework for signal propagation analysis, enabling users to learn important details about signal strength and coverage regions in various settings. This program makes it easier to examine signal propagation and produce instructive signal maps for RF signal tracking algorithm training and testing, whether for research, engineering, or instructional applications. </w:t>
+      </w:r>
+    </w:p>
+    <w:p>
+      <w:pPr>
+        <w:jc w:val="center"/>
+      </w:pPr>
+      <w:r>
+        <w:drawing>
+          <ns3:inline>
+            <ns3:extent cx="5486400" cy="4192172"/>
+            <ns3:docPr id="33004" name="Picture 33004"/>
+            <ns3:cNvGraphicFramePr>
+              <ns5:graphicFrameLocks noChangeAspect="1"/>
+            </ns3:cNvGraphicFramePr>
+            <ns5:graphic>
+              <ns5:graphicData uri="http://schemas.openxmlformats.org/drawingml/2006/picture">
+                <ns6:pic>
+                  <ns6:nvPicPr>
+                    <ns6:cNvPr id="0" name="simulator.png"/>
+                    <ns6:cNvPicPr/>
+                  </ns6:nvPicPr>
+                  <ns6:blipFill>
+                    <ns5:blip ns7:embed="rId13"/>
+                    <ns5:stretch>
+                      <ns5:fillRect/>
+                    </ns5:stretch>
+                  </ns6:blipFill>
+                  <ns6:spPr>
+                    <ns5:xfrm>
+                      <ns5:off x="0" y="0"/>
+                      <ns5:ext cx="5486400" cy="4192172"/>
+                    </ns5:xfrm>
+                    <ns5:prstGeom prst="rect"/>
+                  </ns6:spPr>
+                </ns6:pic>
+              </ns5:graphicData>
+            </ns5:graphic>
+          </ns3:inline>
+        </w:drawing>
+      </w:r>
+    </w:p>
+    <w:p>
+      <w:pPr>
+        <w:jc w:val="center"/>
+      </w:pPr>
+      <w:r>
+        <w:rPr>
+          <w:i/>
+          <w:sz w:val="18"/>
+        </w:rPr>
+        <w:t>Figure: Core Capabilities of RF Propagation &amp; Trajectory Studio</w:t>
       </w:r>
     </w:p>
     <w:p ns2:paraId="5EA240A4" ns2:textId="77777777">
@@ -949,7 +1000,7 @@
         <w:ind w:left="-5" w:right="0"/>
       </w:pPr>
       <w:r>
-        <w:t xml:space="preserve">MATLAB version 2021 or more </w:t>
+        <w:t xml:space="preserve">MATLAB R2025 or later with the following toolboxes: Antenna Toolbox, Communications Toolbox, Phased Array System Toolbox, Mapping Toolbox, Navigation Toolbox, Signal Processing Toolbox </w:t>
       </w:r>
     </w:p>
     <w:p ns2:paraId="45FCA941" ns2:textId="77777777">
@@ -1210,12 +1261,12 @@
     </w:p>
     <w:p ns2:paraId="30BDEEF9" ns2:textId="77777777">
       <w:r>
-        <w:t>"app_codex.m". This file is the current integrated application and exposes the full feature set.</w:t>
+        <w:t>"app.m" is the main integrated application entry point. It exposes the full feature set including coverage analysis, trajectory generation, and dataset export.</w:t>
       </w:r>
     </w:p>
     <w:p ns2:paraId="01858AA6" ns2:textId="77777777">
       <w:r>
-        <w:t>Run "app_codex.m" from MATLAB to access the latest interface for region setup, coverage analysis, site management, trajectory generation, mobility analysis, and dataset creation.</w:t>
+        <w:t>Run app.m from MATLAB to launch the integrated GUI. Type "app" in the MATLAB Command Window and press Enter.</w:t>
       </w:r>
     </w:p>
     <w:p ns2:paraId="7B24A628" ns2:textId="77777777">
@@ -11021,7 +11072,7 @@
         <w:ind w:left="-5" w:right="0"/>
       </w:pPr>
       <w:r>
-        <w:t xml:space="preserve">For investigating signal propagation in a specific environment, the created MATLAB program offers a wide range of features and capabilities. The main features and capabilities made available by the application are outlined in this section. </w:t>
+        <w:t>RF Propagation &amp; Trajectory Studio provides a comprehensive suite of tools for wireless coverage analysis, trajectory simulation, and dataset generation. Key capabilities include:</w:t>
       </w:r>
     </w:p>
     <w:p ns2:paraId="15B59A19" ns2:textId="77777777">
@@ -11295,16 +11346,12 @@
         <w:ind w:left="-5" w:right="0"/>
       </w:pPr>
       <w:r>
-        <w:t xml:space="preserve">The developed </w:t>
+        <w:t>While the application already provides a rich feature set, several enhancements are planned for future releases:</w:t>
       </w:r>
       <w:proofErr w:type="gramStart"/>
-      <w:r>
-        <w:t>MATLAB program</w:t>
-      </w:r>
+      <w:r/>
       <w:proofErr w:type="gramEnd"/>
-      <w:r>
-        <w:t xml:space="preserve"> offers a strong base for signal propagation analysis, but there are many ways to improve it in the future and increase its usefulness. Here are some possible directions for development: </w:t>
-      </w:r>
+      <w:r/>
     </w:p>
     <w:p ns2:paraId="1257DF64" ns2:textId="77777777">
       <w:pPr>
@@ -11512,7 +11559,7 @@
     <w:p ns2:paraId="4E9D9597" ns2:textId="77777777"/>
     <w:p>
       <w:r>
-        <w:t>9.1.1 Network node visualization</w:t>
+        <w:t>The All Node Visualization tab displays the road-network graph nodes used by the transformer-based trajectory generation workflow. When the user clicks "Visualize Network Nodes", the app reads the node coordinate file (word2vec-master_new/data/rome/road/node.csv) and renders every node on a geographic plot using geoplot(). Each dot represents a valid node in the network. Users can hover over any node to see its latitude, longitude, and numeric Node ID. This visualization is essential for identifying seed node IDs to feed into the trajectory generator.</w:t>
       </w:r>
     </w:p>
     <w:p>
@@ -11522,7 +11569,7 @@
     </w:p>
     <w:p>
       <w:r>
-        <w:t>9.2.1 Single-seed synthetic trajectory generation</w:t>
+        <w:t>The Single Seed Input tab accepts a comma-separated list of seed node IDs (e.g., "1234,5678,9012") in the Seed Trajectory text field. When the user clicks "Generate Trajectory", the app sets the PYTHONPATH environment variable to word2vec-master_new, then invokes the Python script word2vec-master_new/visualize/eval.py with the seed IDs as arguments. The Python pipeline uses a trained transformer model to predict a continuation of the input node sequence, producing a synthetic trajectory that follows learned road-network patterns. The resulting trajectory data is saved as a .mat file for further visualization and simulation.</w:t>
       </w:r>
     </w:p>
     <w:p>
@@ -11532,7 +11579,7 @@
     </w:p>
     <w:p>
       <w:r>
-        <w:t>9.3.1 Batch seed processing</w:t>
+        <w:t>The Batch Inputs tab allows users to upload a .mat file containing a matrix of seed trajectories (one row per seed sequence). The app iterates over each row of the matrix and calls the same Python generation pipeline (eval.py) with each seed, passing the row index as a prefix argument. This enables bulk generation of multiple synthetic trajectories in a single operation, which is useful for creating large trajectory datasets for training or evaluation purposes.</w:t>
       </w:r>
     </w:p>
     <w:p>
@@ -11542,7 +11589,16 @@
     </w:p>
     <w:p>
       <w:r>
-        <w:t>9.4 Random path generation and angle modes</w:t>
+        <w:t>The Random Path Generation section provides three trajectory generation modes based on RRT (Rapidly-exploring Random Tree) path planning with building avoidance:</w:t>
+        <w:br/>
+        <w:br/>
+        <w:t>Random Angle Mode: The app downloads OpenStreetMap building data for the specified region, constructs a 256x256 binary occupancy grid where buildings are obstacles, inflates obstacles by the Building Avoidance spinner value, and uses the RRT planner to find collision-free paths. Each generated trajectory consists of 100 sampled waypoints converted to geographic coordinates. A random antenna angle (0-360 degrees) is assigned to each trajectory point.</w:t>
+        <w:br/>
+        <w:br/>
+        <w:t>Fix Angle Mode: Similar to Random Angle, but after generating the path, a random "target" location is selected from the free space. The antenna angle at each waypoint is computed as the bearing from that waypoint toward the fixed target. This simulates a mobile transmitter tracking a stationary target. A random beamwidth (6-20 degrees) is also assigned per trajectory.</w:t>
+        <w:br/>
+        <w:br/>
+        <w:t>Pairwise Target Mode: Requires at least two existing trajectories. The currently selected trajectory (A) is paired with the next trajectory (B). At each point of trajectory A, the angle is computed toward the nearest point on trajectory B, simulating two mobile agents tracking each other. The resulting trajectory A1 replaces A and includes per-point angles and the assigned beamwidth.</w:t>
       </w:r>
     </w:p>
     <w:p>
@@ -11557,7 +11613,19 @@
     </w:p>
     <w:p>
       <w:r>
-        <w:t>9.5 Path visualization, saving, and replay</w:t>
+        <w:t>Generated trajectories are stored in the app state (app.Trajectories cell array) and exposed through the Select Trajectory dropdown. Users can:</w:t>
+        <w:br/>
+        <w:br/>
+        <w:t>Visualize Trajectory: Plots the active trajectory on the geographic map panel. If the trajectory has an associated target location (from Fix Angle mode), a red marker is shown at the target.</w:t>
+        <w:br/>
+        <w:br/>
+        <w:t>Save Trajectory: Exports the active trajectory as a CSV file (latitude, longitude columns). If the trajectory contains angle and target data, a second CSV file (filename_targetAndAngles.csv) is saved with the target coordinates and per-point angles.</w:t>
+        <w:br/>
+        <w:br/>
+        <w:t>Save All: Exports all loaded trajectories to a user-selected directory as separate CSV files (trajectory_1.csv, trajectory_2.csv, etc.).</w:t>
+        <w:br/>
+        <w:br/>
+        <w:t>Visualize A-B and A1 Angle: Displays both trajectories A and B on the map, along with the recomputed A1 trajectory and its per-point angles to verify the pairwise computation.</w:t>
       </w:r>
     </w:p>
     <w:p>
@@ -11567,7 +11635,19 @@
     </w:p>
     <w:p>
       <w:r>
-        <w:t>9.6 Signal simulation along a trajectory</w:t>
+        <w:t>The "Simulate Signal Along Trajectory" feature treats each trajectory waypoint as a transmitter position and computes a signal strength map over a receiver sampling grid.</w:t>
+        <w:br/>
+        <w:br/>
+        <w:t>Configuration: The simulation uses a 28 GHz carrier frequency, 1 W transmitter power, 2 m antenna height, and an 8x8 URA (Uniform Rectangular Array) with Gaussian antenna elements. Each transmitter is oriented according to the stored angle sequence. The beamwidth is taken from the BeamwidthDeg property.</w:t>
+        <w:br/>
+        <w:br/>
+        <w:t>Process: The app creates a site viewer with the local OSM building data, configures one txsite per trajectory point, and uses coverage_test() to sample receiver positions that account for building geometry. The ray-tracing propagation model (SBR method, 1 reflection, 0 diffractions) is used to compute sigstrength() at each receiver for every transmitter position.</w:t>
+        <w:br/>
+        <w:br/>
+        <w:t>Output: For each transmitter position, a table of (Latitude, Longitude, Power) values is written as an Excel file to the output directory (e.g., synctest_trajectoryDataset1/1.xlsx, 2.xlsx, etc.).</w:t>
+        <w:br/>
+        <w:br/>
+        <w:t>"Simulate All" repeats this workflow across all currently loaded trajectories, writing output to sequentially numbered directories (trajectoryDataset1, trajectoryDataset2, etc.). This makes the application suitable for generating trajectory-indexed signal-map datasets.</w:t>
       </w:r>
     </w:p>
     <w:p>
@@ -11582,7 +11662,19 @@
     </w:p>
     <w:p>
       <w:r>
-        <w:t>9.7 Vehicle variation analysis</w:t>
+        <w:t>The Vehicle Models tab compares how different mobile-robot kinematic models follow the active trajectory. Users select one or more vehicle types from a checkbox tree:</w:t>
+        <w:br/>
+        <w:br/>
+        <w:t>Unicycle: A simple kinematic model with linear and angular velocity inputs. Suitable for modeling point robots or simple wheeled vehicles.</w:t>
+        <w:br/>
+        <w:br/>
+        <w:t>Bicycle: A front-steered vehicle model with a maximum steering angle of pi/8 radians. Produces smoother, more realistic turns than the unicycle model.</w:t>
+        <w:br/>
+        <w:br/>
+        <w:t>Differential Drive: A two-wheeled robot with independent wheel speed control. The wheel speed range is set to [-10, 10]*2*pi rad/s.</w:t>
+        <w:br/>
+        <w:br/>
+        <w:t>All models use Pure Pursuit path following with a desired linear velocity of 3 m/s and maximum angular velocity of 3*pi rad/s. The geographic coordinates are converted to UTM for kinematic simulation, then converted back for geographic visualization. Each model path is overlaid on the map panel, allowing users to compare how each vehicle type tracks the reference trajectory.</w:t>
       </w:r>
     </w:p>
     <w:p>
@@ -11592,12 +11684,12 @@
     </w:p>
     <w:p>
       <w:r>
-        <w:t>9.8 Dataset generation in the current app_codex workflow</w:t>
+        <w:t>9.8 Dataset generation in the current app workflow</w:t>
       </w:r>
     </w:p>
     <w:p>
       <w:r>
-        <w:t>The current app_codex.m file also expands dataset generation. In addition to random-site visualization, the Generate button can create a full region dataset by selecting transmitter locations, computing ray-traced signal strength over sampled receiver coordinates, and exporting one spreadsheet per transmitter. This workflow is intended for RF map generation and machine-learning dataset preparation.</w:t>
+        <w:t>The app.m application provides automated region-based dataset generation. When the user clicks "Generate", a dialog prompts for the number of transmitters. The app then: (1) computes a 256m x 256m bounding box from the NW corner coordinates, (2) downloads OSM building data for the region via the OpenStreetMap API, (3) creates an initial txsite with an 8x8 Gaussian URA antenna to identify valid receiver positions using coverage_test(), (4) filters receiver locations to the bounding box, (5) randomly selects transmitter positions from valid locations, (6) configures each transmitter with a random antenna orientation (0-360 degrees), and (7) computes signal strength at all receiver positions using ray-tracing propagation (SBR, 1 reflection). Results are exported as Excel files (one per transmitter) plus a transmitter_coordinates.xlsx index. A progress bar on the Generate button tracks completion.</w:t>
       </w:r>
     </w:p>
     <w:p>
@@ -11607,7 +11699,7 @@
     </w:p>
     <w:p>
       <w:r>
-        <w:t>Some advanced functions in app_codex.m depend on project-specific helper code and local data resources. These include coverage_test, coverage256, coverage256timed, the trajectory class, OpenStreetMap files, and the word2vec-master_new Python workflow. To use all features successfully, these dependencies must remain available in the repository and on the MATLAB path.</w:t>
+        <w:t>Some advanced functions depend on project-specific helper code and local data resources. These include coverage_test (building-aware coverage sampling), coverage256timed (timed 256-sample coverage), and the trajectory class (trajectory.m). The transformer-based trajectory generator requires Python with the word2vec-master_new package installed. OSM building data is fetched automatically via curl from the OpenStreetMap API.</w:t>
       </w:r>
     </w:p>
     <w:p>
@@ -11617,7 +11709,7 @@
     </w:p>
     <w:p>
       <w:r>
-        <w:t>For the latest integrated workflow, users should launch app_codex.m. Older scripts and exported app files may still exist in the repository, but app_codex.m is the maintained entry point that combines the current UI layout with the newest trajectory and dataset-generation functionality.</w:t>
+        <w:t>To launch the application, run app.m from the MATLAB command window. This opens the main GUI with all integrated features: scenario setup, coverage visualization, site management, trajectory generation, mobility analysis, antenna pattern design, vehicle kinematics comparison, and dataset generation.</w:t>
       </w:r>
     </w:p>
     <w:p ns2:paraId="3B4301A2" ns2:textId="2480EA8C">

</xml_diff>

<commit_message>
Rewrite Section 9: restructure trajectory docs with clear hierarchy, bold formatting, and concise descriptions
Co-Authored-By: Claude Opus 4.6 (1M context) <noreply@anthropic.com>
</commit_message>
<xml_diff>
--- a/App Manual_2025.docx
+++ b/App Manual_2025.docx
@@ -11522,196 +11522,725 @@
         <w:t xml:space="preserve"> can develop into a strong and adaptable tool for signal propagation analysis, serving a wider range of users' needs and fostering cutting-edge study and research in wireless communications and antenna design. </w:t>
       </w:r>
     </w:p>
-    <w:p ns2:paraId="095F3B97" ns2:textId="72389467">
+    <w:p>
       <w:pPr>
         <w:pStyle w:val="Heading1"/>
       </w:pPr>
       <w:r>
-        <w:t>9 Synthetic Trajectory Generator</w:t>
-      </w:r>
-    </w:p>
-    <w:p ns2:paraId="37140CA4" ns2:textId="627AC5BF">
+        <w:t xml:space="preserve">9 Trajectory Generation &amp; Simulation</w:t>
+      </w:r>
+    </w:p>
+    <w:p>
+      <w:pPr>
+        <w:pStyle w:val="Normal"/>
+      </w:pPr>
+      <w:r>
+        <w:t xml:space="preserve">The Synthetic Trajectory Generator tab provides tools for creating, visualizing, and simulating mobile trajectories within a geographic region. It supports two generation approaches: transformer-based synthesis from road-network data, and RRT-based obstacle-aware path planning with configurable antenna angle modes.</w:t>
+      </w:r>
+    </w:p>
+    <w:p/>
+    <w:p>
       <w:pPr>
         <w:pStyle w:val="Heading2"/>
       </w:pPr>
       <w:r>
-        <w:t>9.1 All Node Visualization</w:t>
-      </w:r>
-    </w:p>
-    <w:p ns2:paraId="02B923E3" ns2:textId="77777777"/>
-    <w:p ns2:paraId="14424A1B" ns2:textId="4E1D254F">
+        <w:t xml:space="preserve">9.1 Transformer-Based Trajectory Generation</w:t>
+      </w:r>
+    </w:p>
+    <w:p>
+      <w:pPr>
+        <w:pStyle w:val="Normal"/>
+      </w:pPr>
+      <w:r>
+        <w:t xml:space="preserve">This approach uses a pre-trained transformer model to generate synthetic trajectories that follow learned road-network movement patterns. It requires the word2vec-master_new Python package to be installed locally.</w:t>
+      </w:r>
+    </w:p>
+    <w:p/>
+    <w:p>
+      <w:pPr>
+        <w:pStyle w:val="Heading3"/>
+      </w:pPr>
+      <w:r>
+        <w:t xml:space="preserve">9.1.1 Visualize Network Nodes</w:t>
+      </w:r>
+    </w:p>
+    <w:p>
+      <w:pPr>
+        <w:pStyle w:val="Normal"/>
+      </w:pPr>
+      <w:r>
+        <w:t xml:space="preserve">Click </w:t>
+      </w:r>
+      <w:r>
+        <w:rPr>
+          <w:b/>
+        </w:rPr>
+        <w:t xml:space="preserve">Visualize Network Nodes</w:t>
+      </w:r>
+      <w:r>
+        <w:t xml:space="preserve"> to display all available road-network nodes on a geographic plot. The app reads node coordinates from word2vec-master_new/data/rome/road/node.csv and plots each node as a dot. Hover over any node to view its </w:t>
+      </w:r>
+      <w:r>
+        <w:rPr>
+          <w:b/>
+        </w:rPr>
+        <w:t xml:space="preserve">Node ID</w:t>
+      </w:r>
+      <w:r>
+        <w:t xml:space="preserve">, latitude, and longitude. Use these Node IDs as seed inputs for trajectory generation.</w:t>
+      </w:r>
+    </w:p>
+    <w:p/>
+    <w:p>
+      <w:pPr>
+        <w:pStyle w:val="Heading3"/>
+      </w:pPr>
+      <w:r>
+        <w:t xml:space="preserve">9.1.2 Single Seed Generation</w:t>
+      </w:r>
+    </w:p>
+    <w:p>
+      <w:pPr>
+        <w:pStyle w:val="Normal"/>
+      </w:pPr>
+      <w:r>
+        <w:t xml:space="preserve">Enter one or more comma-separated node IDs (e.g., 1234,5678,9012) in the </w:t>
+      </w:r>
+      <w:r>
+        <w:rPr>
+          <w:b/>
+        </w:rPr>
+        <w:t xml:space="preserve">Seed Trajectory</w:t>
+      </w:r>
+      <w:r>
+        <w:t xml:space="preserve"> field, then click </w:t>
+      </w:r>
+      <w:r>
+        <w:rPr>
+          <w:b/>
+        </w:rPr>
+        <w:t xml:space="preserve">Generate Trajectory</w:t>
+      </w:r>
+      <w:r>
+        <w:t xml:space="preserve">. The app invokes the Python script eval.py with these seeds. The transformer model predicts a plausible continuation of the node sequence, producing a synthetic trajectory saved as a .mat file.</w:t>
+      </w:r>
+    </w:p>
+    <w:p/>
+    <w:p>
+      <w:pPr>
+        <w:pStyle w:val="Heading3"/>
+      </w:pPr>
+      <w:r>
+        <w:t xml:space="preserve">9.1.3 Batch Generation</w:t>
+      </w:r>
+    </w:p>
+    <w:p>
+      <w:pPr>
+        <w:pStyle w:val="Normal"/>
+      </w:pPr>
+      <w:r>
+        <w:t xml:space="preserve">Click </w:t>
+      </w:r>
+      <w:r>
+        <w:rPr>
+          <w:b/>
+        </w:rPr>
+        <w:t xml:space="preserve">Upload .mat File</w:t>
+      </w:r>
+      <w:r>
+        <w:t xml:space="preserve"> to load a matrix of seed sequences (one row per trajectory). The app iterates over each row and calls the same Python pipeline, generating multiple synthetic trajectories in a single batch operation.</w:t>
+      </w:r>
+    </w:p>
+    <w:p/>
+    <w:p>
       <w:pPr>
         <w:pStyle w:val="Heading2"/>
       </w:pPr>
       <w:r>
-        <w:t>9.2 Single Seed Input</w:t>
-      </w:r>
-    </w:p>
-    <w:p ns2:paraId="597885DF" ns2:textId="77777777"/>
-    <w:p ns2:paraId="76E71E2E" ns2:textId="6F6228FA">
+        <w:t xml:space="preserve">9.2 RRT-Based Path Planning</w:t>
+      </w:r>
+    </w:p>
+    <w:p>
+      <w:pPr>
+        <w:pStyle w:val="Normal"/>
+      </w:pPr>
+      <w:r>
+        <w:t xml:space="preserve">This approach generates obstacle-aware trajectories using Rapidly-exploring Random Tree (RRT) path planning. The app downloads OpenStreetMap building data for the specified region, builds a 256x256 binary occupancy grid, and plans collision-free paths. Each trajectory is sampled to 100 waypoints in geographic coordinates.</w:t>
+      </w:r>
+    </w:p>
+    <w:p/>
+    <w:p>
+      <w:pPr>
+        <w:pStyle w:val="Normal"/>
+      </w:pPr>
+      <w:r>
+        <w:rPr>
+          <w:b/>
+        </w:rPr>
+        <w:t xml:space="preserve">Configuration parameters:</w:t>
+      </w:r>
+    </w:p>
+    <w:p>
+      <w:pPr>
+        <w:pStyle w:val="Normal"/>
+      </w:pPr>
+      <w:r>
+        <w:rPr>
+          <w:b/>
+        </w:rPr>
+        <w:t xml:space="preserve">NW Latitude / NW Longitude</w:t>
+      </w:r>
+      <w:r>
+        <w:t xml:space="preserve"> — northwest corner of the target region.</w:t>
+      </w:r>
+    </w:p>
+    <w:p>
+      <w:pPr>
+        <w:pStyle w:val="Normal"/>
+      </w:pPr>
+      <w:r>
+        <w:rPr>
+          <w:b/>
+        </w:rPr>
+        <w:t xml:space="preserve">Number of Trajectories</w:t>
+      </w:r>
+      <w:r>
+        <w:t xml:space="preserve"> — how many paths to generate.</w:t>
+      </w:r>
+    </w:p>
+    <w:p>
+      <w:pPr>
+        <w:pStyle w:val="Normal"/>
+      </w:pPr>
+      <w:r>
+        <w:rPr>
+          <w:b/>
+        </w:rPr>
+        <w:t xml:space="preserve">Building Avoidance</w:t>
+      </w:r>
+      <w:r>
+        <w:t xml:space="preserve"> — obstacle inflation radius (in grid cells). Higher values keep trajectories farther from buildings.</w:t>
+      </w:r>
+    </w:p>
+    <w:p/>
+    <w:p>
+      <w:pPr>
+        <w:pStyle w:val="Heading3"/>
+      </w:pPr>
+      <w:r>
+        <w:t xml:space="preserve">9.2.1 Antenna Angle Modes</w:t>
+      </w:r>
+    </w:p>
+    <w:p>
+      <w:pPr>
+        <w:pStyle w:val="Normal"/>
+      </w:pPr>
+      <w:r>
+        <w:t xml:space="preserve">Each trajectory point carries an antenna orientation angle. Three modes control how angles are assigned:</w:t>
+      </w:r>
+    </w:p>
+    <w:p/>
+    <w:p>
+      <w:pPr>
+        <w:pStyle w:val="Normal"/>
+      </w:pPr>
+      <w:r>
+        <w:rPr>
+          <w:b/>
+        </w:rPr>
+        <w:t xml:space="preserve">Random Angle</w:t>
+      </w:r>
+      <w:r>
+        <w:t xml:space="preserve"> — Each waypoint receives a random antenna angle between 0° and 360°. Click the Random angle button to generate trajectories in this mode.</w:t>
+      </w:r>
+    </w:p>
+    <w:p>
+      <w:pPr>
+        <w:pStyle w:val="Normal"/>
+      </w:pPr>
+      <w:r>
+        <w:rPr>
+          <w:b/>
+        </w:rPr>
+        <w:t xml:space="preserve">Fix Angle</w:t>
+      </w:r>
+      <w:r>
+        <w:t xml:space="preserve"> — A stationary target is randomly placed in the free space. At each waypoint, the antenna angle is computed as the geographic bearing toward that target, simulating a mobile transmitter tracking a fixed receiver. A random beamwidth (6–20°) is assigned per trajectory. Click the Fix angle button to use this mode.</w:t>
+      </w:r>
+    </w:p>
+    <w:p>
+      <w:pPr>
+        <w:pStyle w:val="Normal"/>
+      </w:pPr>
+      <w:r>
+        <w:rPr>
+          <w:b/>
+        </w:rPr>
+        <w:t xml:space="preserve">Pairwise Target</w:t>
+      </w:r>
+      <w:r>
+        <w:t xml:space="preserve"> — Requires at least two existing trajectories. The selected trajectory (A) is paired with the next one (B). At each point of A, the angle points toward the nearest point on B, simulating two mobile agents tracking each other. Click the Pairwise Target button to use this mode.</w:t>
+      </w:r>
+    </w:p>
+    <w:p/>
+    <w:p>
       <w:pPr>
         <w:pStyle w:val="Heading2"/>
       </w:pPr>
       <w:r>
-        <w:t>9.3 Batch Inputs</w:t>
-      </w:r>
-    </w:p>
-    <w:p ns2:paraId="4E9D9597" ns2:textId="77777777"/>
+        <w:t xml:space="preserve">9.3 Trajectory Management</w:t>
+      </w:r>
+    </w:p>
     <w:p>
-      <w:r>
-        <w:t>The All Node Visualization tab displays the road-network graph nodes used by the transformer-based trajectory generation workflow. When the user clicks "Visualize Network Nodes", the app reads the node coordinate file (word2vec-master_new/data/rome/road/node.csv) and renders every node on a geographic plot using geoplot(). Each dot represents a valid node in the network. Users can hover over any node to see its latitude, longitude, and numeric Node ID. This visualization is essential for identifying seed node IDs to feed into the trajectory generator.</w:t>
-      </w:r>
-    </w:p>
+      <w:pPr>
+        <w:pStyle w:val="Normal"/>
+      </w:pPr>
+      <w:r>
+        <w:t xml:space="preserve">All generated trajectories are stored internally and listed in the </w:t>
+      </w:r>
+      <w:r>
+        <w:rPr>
+          <w:b/>
+        </w:rPr>
+        <w:t xml:space="preserve">Select Trajectory</w:t>
+      </w:r>
+      <w:r>
+        <w:t xml:space="preserve"> dropdown. The following actions are available:</w:t>
+      </w:r>
+    </w:p>
+    <w:p/>
     <w:p>
-      <w:r>
-        <w:t>The All Node Visualization tab displays the road-network nodes used by the trajectory generation workflow. The app reads node coordinates from the word2vec-master_new data folder and plots them on a geographic map so the user can inspect available node IDs before creating synthetic trajectories.</w:t>
+      <w:pPr>
+        <w:pStyle w:val="Normal"/>
+      </w:pPr>
+      <w:r>
+        <w:rPr>
+          <w:b/>
+        </w:rPr>
+        <w:t xml:space="preserve">Visualize Trajectory</w:t>
+      </w:r>
+      <w:r>
+        <w:t xml:space="preserve"> — Plots the active trajectory on the map. If the trajectory has an associated target (Fix Angle mode), a red dot marks the target location.</w:t>
       </w:r>
     </w:p>
     <w:p>
-      <w:r>
-        <w:t>The Single Seed Input tab accepts a comma-separated list of seed node IDs (e.g., "1234,5678,9012") in the Seed Trajectory text field. When the user clicks "Generate Trajectory", the app sets the PYTHONPATH environment variable to word2vec-master_new, then invokes the Python script word2vec-master_new/visualize/eval.py with the seed IDs as arguments. The Python pipeline uses a trained transformer model to predict a continuation of the input node sequence, producing a synthetic trajectory that follows learned road-network patterns. The resulting trajectory data is saved as a .mat file for further visualization and simulation.</w:t>
+      <w:pPr>
+        <w:pStyle w:val="Normal"/>
+      </w:pPr>
+      <w:r>
+        <w:rPr>
+          <w:b/>
+        </w:rPr>
+        <w:t xml:space="preserve">Save Trajectory</w:t>
+      </w:r>
+      <w:r>
+        <w:t xml:space="preserve"> — Exports the active trajectory as a CSV file with latitude and longitude columns. If angle and target data exist, a second file (*_targetAndAngles.csv) is saved alongside.</w:t>
       </w:r>
     </w:p>
     <w:p>
-      <w:r>
-        <w:t>The Single Seed tab accepts one or more comma-separated seed node IDs and launches the Python-based generator in word2vec-master_new/visualize/eval.py. The generated trajectory output is used to prepare synthetic trajectories that can later be visualized or simulated inside the MATLAB app.</w:t>
+      <w:pPr>
+        <w:pStyle w:val="Normal"/>
+      </w:pPr>
+      <w:r>
+        <w:rPr>
+          <w:b/>
+        </w:rPr>
+        <w:t xml:space="preserve">Save All</w:t>
+      </w:r>
+      <w:r>
+        <w:t xml:space="preserve"> — Exports every loaded trajectory to a chosen directory as trajectory_1.csv, trajectory_2.csv, etc.</w:t>
       </w:r>
     </w:p>
     <w:p>
-      <w:r>
-        <w:t>The Batch Inputs tab allows users to upload a .mat file containing a matrix of seed trajectories (one row per seed sequence). The app iterates over each row of the matrix and calls the same Python generation pipeline (eval.py) with each seed, passing the row index as a prefix argument. This enables bulk generation of multiple synthetic trajectories in a single operation, which is useful for creating large trajectory datasets for training or evaluation purposes.</w:t>
-      </w:r>
-    </w:p>
+      <w:pPr>
+        <w:pStyle w:val="Normal"/>
+      </w:pPr>
+      <w:r>
+        <w:rPr>
+          <w:b/>
+        </w:rPr>
+        <w:t xml:space="preserve">Visualize A-B and A1 Angle</w:t>
+      </w:r>
+      <w:r>
+        <w:t xml:space="preserve"> — Overlays trajectories A and B on the map with the recomputed pairwise angle vectors for verification.</w:t>
+      </w:r>
+    </w:p>
+    <w:p/>
     <w:p>
-      <w:r>
-        <w:t>The Batch Inputs tab accepts a MAT file containing multiple seed trajectories. Each row is passed to the same Python generation pipeline so that several synthetic trajectories can be produced in one run.</w:t>
+      <w:pPr>
+        <w:pStyle w:val="Heading2"/>
+      </w:pPr>
+      <w:r>
+        <w:t xml:space="preserve">9.4 Signal Simulation Along Trajectories</w:t>
       </w:r>
     </w:p>
     <w:p>
-      <w:r>
-        <w:t>The Random Path Generation section provides three trajectory generation modes based on RRT (Rapidly-exploring Random Tree) path planning with building avoidance:</w:t>
-        <w:br/>
-        <w:br/>
-        <w:t>Random Angle Mode: The app downloads OpenStreetMap building data for the specified region, constructs a 256x256 binary occupancy grid where buildings are obstacles, inflates obstacles by the Building Avoidance spinner value, and uses the RRT planner to find collision-free paths. Each generated trajectory consists of 100 sampled waypoints converted to geographic coordinates. A random antenna angle (0-360 degrees) is assigned to each trajectory point.</w:t>
-        <w:br/>
-        <w:br/>
-        <w:t>Fix Angle Mode: Similar to Random Angle, but after generating the path, a random "target" location is selected from the free space. The antenna angle at each waypoint is computed as the bearing from that waypoint toward the fixed target. This simulates a mobile transmitter tracking a stationary target. A random beamwidth (6-20 degrees) is also assigned per trajectory.</w:t>
-        <w:br/>
-        <w:br/>
-        <w:t>Pairwise Target Mode: Requires at least two existing trajectories. The currently selected trajectory (A) is paired with the next trajectory (B). At each point of trajectory A, the angle is computed toward the nearest point on trajectory B, simulating two mobile agents tracking each other. The resulting trajectory A1 replaces A and includes per-point angles and the assigned beamwidth.</w:t>
-      </w:r>
-    </w:p>
+      <w:pPr>
+        <w:pStyle w:val="Normal"/>
+      </w:pPr>
+      <w:r>
+        <w:t xml:space="preserve">This feature treats each trajectory waypoint as a transmitter and computes a signal strength map at receiver sample points across the region.</w:t>
+      </w:r>
+    </w:p>
+    <w:p/>
     <w:p>
-      <w:r>
-        <w:t>The Trajectory Lab section adds a second family of trajectory tools based on local path planning. The app can build random obstacle-aware paths inside a 256 x 256 target region using OpenStreetMap building footprints, occupancy maps, and an RRT planner.</w:t>
+      <w:pPr>
+        <w:pStyle w:val="Normal"/>
+      </w:pPr>
+      <w:r>
+        <w:rPr>
+          <w:b/>
+        </w:rPr>
+        <w:t xml:space="preserve">Simulation parameters:</w:t>
       </w:r>
     </w:p>
     <w:p>
-      <w:r>
-        <w:t>The Random angle mode creates trajectories and assigns a random antenna angle sequence. The Fix angle mode generates trajectories with a fixed target point and stored per-step angle information. The Pairwise Target mode computes the angle from one trajectory to another trajectory point-by-point, which is useful for relative pointing experiments between moving nodes.</w:t>
+      <w:pPr>
+        <w:pStyle w:val="Normal"/>
+      </w:pPr>
+      <w:r>
+        <w:t xml:space="preserve">• Carrier frequency: 28 GHz</w:t>
       </w:r>
     </w:p>
     <w:p>
-      <w:r>
-        <w:t>Generated trajectories are stored in the app state (app.Trajectories cell array) and exposed through the Select Trajectory dropdown. Users can:</w:t>
-        <w:br/>
-        <w:br/>
-        <w:t>Visualize Trajectory: Plots the active trajectory on the geographic map panel. If the trajectory has an associated target location (from Fix Angle mode), a red marker is shown at the target.</w:t>
-        <w:br/>
-        <w:br/>
-        <w:t>Save Trajectory: Exports the active trajectory as a CSV file (latitude, longitude columns). If the trajectory contains angle and target data, a second CSV file (filename_targetAndAngles.csv) is saved with the target coordinates and per-point angles.</w:t>
-        <w:br/>
-        <w:br/>
-        <w:t>Save All: Exports all loaded trajectories to a user-selected directory as separate CSV files (trajectory_1.csv, trajectory_2.csv, etc.).</w:t>
-        <w:br/>
-        <w:br/>
-        <w:t>Visualize A-B and A1 Angle: Displays both trajectories A and B on the map, along with the recomputed A1 trajectory and its per-point angles to verify the pairwise computation.</w:t>
+      <w:pPr>
+        <w:pStyle w:val="Normal"/>
+      </w:pPr>
+      <w:r>
+        <w:t xml:space="preserve">• Transmitter power: 1 W</w:t>
       </w:r>
     </w:p>
     <w:p>
-      <w:r>
-        <w:t>Generated trajectories are stored in the app state and exposed through the Select Trajectory dropdown. Users can visualize the active trajectory on the map, save a single trajectory to CSV, save all currently generated trajectories, or display pairwise angle annotations between trajectory A and trajectory B.</w:t>
+      <w:pPr>
+        <w:pStyle w:val="Normal"/>
+      </w:pPr>
+      <w:r>
+        <w:t xml:space="preserve">• Antenna height: 2 m</w:t>
       </w:r>
     </w:p>
     <w:p>
-      <w:r>
-        <w:t>The "Simulate Signal Along Trajectory" feature treats each trajectory waypoint as a transmitter position and computes a signal strength map over a receiver sampling grid.</w:t>
-        <w:br/>
-        <w:br/>
-        <w:t>Configuration: The simulation uses a 28 GHz carrier frequency, 1 W transmitter power, 2 m antenna height, and an 8x8 URA (Uniform Rectangular Array) with Gaussian antenna elements. Each transmitter is oriented according to the stored angle sequence. The beamwidth is taken from the BeamwidthDeg property.</w:t>
-        <w:br/>
-        <w:br/>
-        <w:t>Process: The app creates a site viewer with the local OSM building data, configures one txsite per trajectory point, and uses coverage_test() to sample receiver positions that account for building geometry. The ray-tracing propagation model (SBR method, 1 reflection, 0 diffractions) is used to compute sigstrength() at each receiver for every transmitter position.</w:t>
-        <w:br/>
-        <w:br/>
-        <w:t>Output: For each transmitter position, a table of (Latitude, Longitude, Power) values is written as an Excel file to the output directory (e.g., synctest_trajectoryDataset1/1.xlsx, 2.xlsx, etc.).</w:t>
-        <w:br/>
-        <w:br/>
-        <w:t>"Simulate All" repeats this workflow across all currently loaded trajectories, writing output to sequentially numbered directories (trajectoryDataset1, trajectoryDataset2, etc.). This makes the application suitable for generating trajectory-indexed signal-map datasets.</w:t>
+      <w:pPr>
+        <w:pStyle w:val="Normal"/>
+      </w:pPr>
+      <w:r>
+        <w:t xml:space="preserve">• Antenna: 8×8 Uniform Rectangular Array (URA) with Gaussian elements</w:t>
       </w:r>
     </w:p>
     <w:p>
-      <w:r>
-        <w:t>The Simulate Signal Along Trajectory feature treats each trajectory point as a transmitter position and computes a signal map over a receiver sampling region. The app configures a phased antenna array for each step, applies the corresponding stored antenna angle when available, and exports per-step signal maps for downstream analysis.</w:t>
+      <w:pPr>
+        <w:pStyle w:val="Normal"/>
+      </w:pPr>
+      <w:r>
+        <w:t xml:space="preserve">• Propagation model: Ray-tracing (SBR), 1 reflection, 0 diffractions</w:t>
       </w:r>
     </w:p>
     <w:p>
-      <w:r>
-        <w:t>The Simulate All action repeats this workflow across all currently loaded trajectories. This makes the application suitable for generating trajectory-conditioned RF datasets rather than only static coverage snapshots.</w:t>
-      </w:r>
-    </w:p>
+      <w:pPr>
+        <w:pStyle w:val="Normal"/>
+      </w:pPr>
+      <w:r>
+        <w:t xml:space="preserve">• Antenna angle and beamwidth: taken from the trajectory properties</w:t>
+      </w:r>
+    </w:p>
+    <w:p/>
     <w:p>
-      <w:r>
-        <w:t>The Vehicle Models tab compares how different mobile-robot kinematic models follow the active trajectory. Users select one or more vehicle types from a checkbox tree:</w:t>
-        <w:br/>
-        <w:br/>
-        <w:t>Unicycle: A simple kinematic model with linear and angular velocity inputs. Suitable for modeling point robots or simple wheeled vehicles.</w:t>
-        <w:br/>
-        <w:br/>
-        <w:t>Bicycle: A front-steered vehicle model with a maximum steering angle of pi/8 radians. Produces smoother, more realistic turns than the unicycle model.</w:t>
-        <w:br/>
-        <w:br/>
-        <w:t>Differential Drive: A two-wheeled robot with independent wheel speed control. The wheel speed range is set to [-10, 10]*2*pi rad/s.</w:t>
-        <w:br/>
-        <w:br/>
-        <w:t>All models use Pure Pursuit path following with a desired linear velocity of 3 m/s and maximum angular velocity of 3*pi rad/s. The geographic coordinates are converted to UTM for kinematic simulation, then converted back for geographic visualization. Each model path is overlaid on the map panel, allowing users to compare how each vehicle type tracks the reference trajectory.</w:t>
+      <w:pPr>
+        <w:pStyle w:val="Normal"/>
+      </w:pPr>
+      <w:r>
+        <w:rPr>
+          <w:b/>
+        </w:rPr>
+        <w:t xml:space="preserve">Workflow:</w:t>
       </w:r>
     </w:p>
     <w:p>
-      <w:r>
-        <w:t>The Vehicle Models tab compares how different mobile-robot kinematic models follow the currently active trajectory. The application supports unicycle, bicycle, and differential-drive models, converts geographic coordinates to UTM coordinates, simulates tracking with pure-pursuit controllers, and plots the resulting paths back on the map.</w:t>
+      <w:pPr>
+        <w:pStyle w:val="Normal"/>
+      </w:pPr>
+      <w:r>
+        <w:t xml:space="preserve">1. The app loads OSM building data and creates a site viewer.</w:t>
       </w:r>
     </w:p>
     <w:p>
-      <w:r>
-        <w:t>9.8 Dataset generation in the current app workflow</w:t>
+      <w:pPr>
+        <w:pStyle w:val="Normal"/>
+      </w:pPr>
+      <w:r>
+        <w:t xml:space="preserve">2. One txsite is created per trajectory waypoint, each configured with the stored angle and beamwidth.</w:t>
       </w:r>
     </w:p>
     <w:p>
-      <w:r>
-        <w:t>The app.m application provides automated region-based dataset generation. When the user clicks "Generate", a dialog prompts for the number of transmitters. The app then: (1) computes a 256m x 256m bounding box from the NW corner coordinates, (2) downloads OSM building data for the region via the OpenStreetMap API, (3) creates an initial txsite with an 8x8 Gaussian URA antenna to identify valid receiver positions using coverage_test(), (4) filters receiver locations to the bounding box, (5) randomly selects transmitter positions from valid locations, (6) configures each transmitter with a random antenna orientation (0-360 degrees), and (7) computes signal strength at all receiver positions using ray-tracing propagation (SBR, 1 reflection). Results are exported as Excel files (one per transmitter) plus a transmitter_coordinates.xlsx index. A progress bar on the Generate button tracks completion.</w:t>
+      <w:pPr>
+        <w:pStyle w:val="Normal"/>
+      </w:pPr>
+      <w:r>
+        <w:t xml:space="preserve">3. Receiver positions are sampled using coverage_test() to account for building geometry, then filtered to the 256 m bounding box.</w:t>
       </w:r>
     </w:p>
     <w:p>
-      <w:r>
-        <w:t>9.9 External dependencies and operational notes</w:t>
+      <w:pPr>
+        <w:pStyle w:val="Normal"/>
+      </w:pPr>
+      <w:r>
+        <w:t xml:space="preserve">4. sigstrength() computes the received power at every sample point for each transmitter.</w:t>
       </w:r>
     </w:p>
     <w:p>
-      <w:r>
-        <w:t>Some advanced functions depend on project-specific helper code and local data resources. These include coverage_test (building-aware coverage sampling), coverage256timed (timed 256-sample coverage), and the trajectory class (trajectory.m). The transformer-based trajectory generator requires Python with the word2vec-master_new package installed. OSM building data is fetched automatically via curl from the OpenStreetMap API.</w:t>
-      </w:r>
-    </w:p>
+      <w:pPr>
+        <w:pStyle w:val="Normal"/>
+      </w:pPr>
+      <w:r>
+        <w:t xml:space="preserve">5. Results are exported as Excel files (one per waypoint) to the output directory (e.g., synctest_trajectoryDataset1/).</w:t>
+      </w:r>
+    </w:p>
+    <w:p/>
     <w:p>
-      <w:r>
-        <w:t>9.10 Recommended launch entry</w:t>
-      </w:r>
-    </w:p>
+      <w:pPr>
+        <w:pStyle w:val="Normal"/>
+      </w:pPr>
+      <w:r>
+        <w:rPr>
+          <w:b/>
+        </w:rPr>
+        <w:t xml:space="preserve">Simulate All</w:t>
+      </w:r>
+      <w:r>
+        <w:t xml:space="preserve"> repeats this for every loaded trajectory, writing to sequentially numbered directories (trajectoryDataset1/, trajectoryDataset2/, etc.). This is designed for generating trajectory-indexed signal-map datasets at scale.</w:t>
+      </w:r>
+    </w:p>
+    <w:p/>
     <w:p>
-      <w:r>
-        <w:t>To launch the application, run app.m from the MATLAB command window. This opens the main GUI with all integrated features: scenario setup, coverage visualization, site management, trajectory generation, mobility analysis, antenna pattern design, vehicle kinematics comparison, and dataset generation.</w:t>
-      </w:r>
-    </w:p>
+      <w:pPr>
+        <w:pStyle w:val="Heading2"/>
+      </w:pPr>
+      <w:r>
+        <w:t xml:space="preserve">9.5 Vehicle Kinematics Comparison</w:t>
+      </w:r>
+    </w:p>
+    <w:p>
+      <w:pPr>
+        <w:pStyle w:val="Normal"/>
+      </w:pPr>
+      <w:r>
+        <w:t xml:space="preserve">The Vehicle Variation tab simulates how different mobile-robot kinematic models follow the active trajectory. Select one or more models from the checkbox tree:</w:t>
+      </w:r>
+    </w:p>
+    <w:p/>
+    <w:p>
+      <w:pPr>
+        <w:pStyle w:val="Normal"/>
+      </w:pPr>
+      <w:r>
+        <w:rPr>
+          <w:b/>
+        </w:rPr>
+        <w:t xml:space="preserve">Unicycle</w:t>
+      </w:r>
+      <w:r>
+        <w:t xml:space="preserve"> — Point-robot model with direct linear and angular velocity inputs. Simple and fast; suitable for basic motion analysis.</w:t>
+      </w:r>
+    </w:p>
+    <w:p>
+      <w:pPr>
+        <w:pStyle w:val="Normal"/>
+      </w:pPr>
+      <w:r>
+        <w:rPr>
+          <w:b/>
+        </w:rPr>
+        <w:t xml:space="preserve">Bicycle</w:t>
+      </w:r>
+      <w:r>
+        <w:t xml:space="preserve"> — Front-steered vehicle with a maximum steering angle of π/8 rad. Produces smoother, more realistic cornering behavior.</w:t>
+      </w:r>
+    </w:p>
+    <w:p>
+      <w:pPr>
+        <w:pStyle w:val="Normal"/>
+      </w:pPr>
+      <w:r>
+        <w:rPr>
+          <w:b/>
+        </w:rPr>
+        <w:t xml:space="preserve">Differential Drive</w:t>
+      </w:r>
+      <w:r>
+        <w:t xml:space="preserve"> — Two-wheeled robot with independent wheel speed control (range: ±10×2π rad/s). Can turn in place.</w:t>
+      </w:r>
+    </w:p>
+    <w:p/>
+    <w:p>
+      <w:pPr>
+        <w:pStyle w:val="Normal"/>
+      </w:pPr>
+      <w:r>
+        <w:t xml:space="preserve">All models use Pure Pursuit path following (linear velocity 3 m/s, max angular velocity 3π rad/s). Geographic coordinates are converted to UTM for simulation, then back for map overlay. Each model's resulting path is plotted alongside the reference trajectory for comparison.</w:t>
+      </w:r>
+    </w:p>
+    <w:p/>
+    <w:p>
+      <w:pPr>
+        <w:pStyle w:val="Heading2"/>
+      </w:pPr>
+      <w:r>
+        <w:t xml:space="preserve">9.6 Region-Based Dataset Generation</w:t>
+      </w:r>
+    </w:p>
+    <w:p>
+      <w:pPr>
+        <w:pStyle w:val="Normal"/>
+      </w:pPr>
+      <w:r>
+        <w:t xml:space="preserve">The Generate button launches automated signal-map dataset creation for a specified region:</w:t>
+      </w:r>
+    </w:p>
+    <w:p/>
+    <w:p>
+      <w:pPr>
+        <w:pStyle w:val="Normal"/>
+      </w:pPr>
+      <w:r>
+        <w:t xml:space="preserve">1. Enter the </w:t>
+      </w:r>
+      <w:r>
+        <w:rPr>
+          <w:b/>
+        </w:rPr>
+        <w:t xml:space="preserve">NW Latitude</w:t>
+      </w:r>
+      <w:r>
+        <w:t xml:space="preserve"> and </w:t>
+      </w:r>
+      <w:r>
+        <w:rPr>
+          <w:b/>
+        </w:rPr>
+        <w:t xml:space="preserve">NW Longitude</w:t>
+      </w:r>
+      <w:r>
+        <w:t xml:space="preserve"> to define a 256 m × 256 m region.</w:t>
+      </w:r>
+    </w:p>
+    <w:p>
+      <w:pPr>
+        <w:pStyle w:val="Normal"/>
+      </w:pPr>
+      <w:r>
+        <w:t xml:space="preserve">2. Click Generate and enter the desired number of transmitters in the dialog.</w:t>
+      </w:r>
+    </w:p>
+    <w:p>
+      <w:pPr>
+        <w:pStyle w:val="Normal"/>
+      </w:pPr>
+      <w:r>
+        <w:t xml:space="preserve">3. The app downloads OSM building data, identifies valid (non-building) receiver positions, and randomly places transmitters at valid locations.</w:t>
+      </w:r>
+    </w:p>
+    <w:p>
+      <w:pPr>
+        <w:pStyle w:val="Normal"/>
+      </w:pPr>
+      <w:r>
+        <w:t xml:space="preserve">4. Each transmitter is configured with an 8×8 Gaussian URA antenna at a random orientation.</w:t>
+      </w:r>
+    </w:p>
+    <w:p>
+      <w:pPr>
+        <w:pStyle w:val="Normal"/>
+      </w:pPr>
+      <w:r>
+        <w:t xml:space="preserve">5. Signal strength is computed using ray-tracing (SBR, 1 reflection) and exported as Excel files. A transmitter_coordinates.xlsx index file is also generated.</w:t>
+      </w:r>
+    </w:p>
+    <w:p/>
+    <w:p>
+      <w:pPr>
+        <w:pStyle w:val="Normal"/>
+      </w:pPr>
+      <w:r>
+        <w:t xml:space="preserve">A progress bar on the button tracks completion during generation.</w:t>
+      </w:r>
+    </w:p>
+    <w:p/>
+    <w:p>
+      <w:pPr>
+        <w:pStyle w:val="Heading2"/>
+      </w:pPr>
+      <w:r>
+        <w:t xml:space="preserve">9.7 Dependencies &amp; Notes</w:t>
+      </w:r>
+    </w:p>
+    <w:p>
+      <w:pPr>
+        <w:pStyle w:val="Normal"/>
+      </w:pPr>
+      <w:r>
+        <w:t xml:space="preserve">• </w:t>
+      </w:r>
+      <w:r>
+        <w:rPr>
+          <w:b/>
+        </w:rPr>
+        <w:t xml:space="preserve">coverage_test</w:t>
+      </w:r>
+      <w:r>
+        <w:t xml:space="preserve"> and </w:t>
+      </w:r>
+      <w:r>
+        <w:rPr>
+          <w:b/>
+        </w:rPr>
+        <w:t xml:space="preserve">coverage256timed</w:t>
+      </w:r>
+      <w:r>
+        <w:t xml:space="preserve"> — building-aware coverage sampling helpers (included in repo).</w:t>
+      </w:r>
+    </w:p>
+    <w:p>
+      <w:pPr>
+        <w:pStyle w:val="Normal"/>
+      </w:pPr>
+      <w:r>
+        <w:t xml:space="preserve">• </w:t>
+      </w:r>
+      <w:r>
+        <w:rPr>
+          <w:b/>
+        </w:rPr>
+        <w:t xml:space="preserve">trajectory.m</w:t>
+      </w:r>
+      <w:r>
+        <w:t xml:space="preserve"> — trajectory data class used to store waypoints, angles, targets, and beamwidth.</w:t>
+      </w:r>
+    </w:p>
+    <w:p>
+      <w:pPr>
+        <w:pStyle w:val="Normal"/>
+      </w:pPr>
+      <w:r>
+        <w:t xml:space="preserve">• </w:t>
+      </w:r>
+      <w:r>
+        <w:rPr>
+          <w:b/>
+        </w:rPr>
+        <w:t xml:space="preserve">Python + word2vec-master_new</w:t>
+      </w:r>
+      <w:r>
+        <w:t xml:space="preserve"> — required only for transformer-based trajectory generation (Section 9.1).</w:t>
+      </w:r>
+    </w:p>
+    <w:p>
+      <w:pPr>
+        <w:pStyle w:val="Normal"/>
+      </w:pPr>
+      <w:r>
+        <w:t xml:space="preserve">• OSM data is fetched automatically via the OpenStreetMap API using curl.</w:t>
+      </w:r>
+    </w:p>
+    <w:p/>
     <w:p ns2:paraId="3B4301A2" ns2:textId="2480EA8C">
       <w:pPr>
         <w:pStyle w:val="Heading1"/>

</xml_diff>

<commit_message>
Unify document formatting: fix 53 heading styles, bold key terms across all sections, format title/captions
Co-Authored-By: Claude Opus 4.6 (1M context) <noreply@anthropic.com>
</commit_message>
<xml_diff>
--- a/App Manual_2025.docx
+++ b/App Manual_2025.docx
@@ -141,7 +141,7 @@
       <w:pPr>
         <w:spacing w:after="0" w:line="259" w:lineRule="auto"/>
         <w:ind w:left="36" w:right="0" w:firstLine="0"/>
-        <w:jc w:val="left"/>
+        <w:jc w:val="center"/>
       </w:pPr>
       <w:r>
         <w:rPr>
@@ -187,7 +187,7 @@
       </w:pPr>
       <w:r>
         <w:rPr>
-          <w:sz w:val="40"/>
+          <w:sz w:val="28"/>
         </w:rPr>
         <w:t xml:space="preserve">User Manual and Documentation </w:t>
       </w:r>
@@ -230,6 +230,7 @@
     </w:p>
     <w:p ns2:paraId="26FA2E34" ns2:textId="6CD41E16">
       <w:pPr>
+        <w:pStyle w:val="Heading1"/>
         <w:spacing w:after="0" w:line="259" w:lineRule="auto"/>
         <w:ind w:left="0" w:right="0" w:firstLine="0"/>
         <w:jc w:val="left"/>
@@ -479,7 +480,13 @@
         <w:ind w:right="0" w:hanging="360"/>
       </w:pPr>
       <w:r>
-        <w:t xml:space="preserve">Simplify Signal Propagation Analysis: </w:t>
+        <w:rPr>
+          <w:b/>
+        </w:rPr>
+        <w:t xml:space="preserve">Simplify Signal Propagation Analysis:</w:t>
+      </w:r>
+      <w:r>
+        <w:t xml:space="preserve"> </w:t>
       </w:r>
     </w:p>
     <w:p ns2:paraId="782F7792" ns2:textId="77777777">
@@ -531,7 +538,13 @@
         <w:ind w:right="0" w:hanging="360"/>
       </w:pPr>
       <w:r>
-        <w:t xml:space="preserve">Facilitate Transmitter and Receiver Placement: </w:t>
+        <w:rPr>
+          <w:b/>
+        </w:rPr>
+        <w:t xml:space="preserve">Facilitate Transmitter and Receiver Placement:</w:t>
+      </w:r>
+      <w:r>
+        <w:t xml:space="preserve"> </w:t>
       </w:r>
     </w:p>
     <w:p ns2:paraId="652EFD77" ns2:textId="77777777">
@@ -591,7 +604,13 @@
         <w:ind w:right="0" w:hanging="360"/>
       </w:pPr>
       <w:r>
-        <w:t xml:space="preserve">Generate Informative Signal Maps: </w:t>
+        <w:rPr>
+          <w:b/>
+        </w:rPr>
+        <w:t xml:space="preserve">Generate Informative Signal Maps:</w:t>
+      </w:r>
+      <w:r>
+        <w:t xml:space="preserve"> </w:t>
       </w:r>
     </w:p>
     <w:p ns2:paraId="14BA8AA6" ns2:textId="77777777">
@@ -651,7 +670,13 @@
         <w:ind w:right="0" w:hanging="360"/>
       </w:pPr>
       <w:r>
-        <w:t xml:space="preserve">Enable Dataset Generation and Export: </w:t>
+        <w:rPr>
+          <w:b/>
+        </w:rPr>
+        <w:t xml:space="preserve">Enable Dataset Generation and Export:</w:t>
+      </w:r>
+      <w:r>
+        <w:t xml:space="preserve"> </w:t>
       </w:r>
     </w:p>
     <w:p ns2:paraId="203A97F1" ns2:textId="77777777">
@@ -741,7 +766,13 @@
         <w:ind w:right="0" w:hanging="360"/>
       </w:pPr>
       <w:r>
-        <w:t xml:space="preserve">Telecommunication Engineers and Researchers: </w:t>
+        <w:rPr>
+          <w:b/>
+        </w:rPr>
+        <w:t xml:space="preserve">Telecommunication Engineers and Researchers:</w:t>
+      </w:r>
+      <w:r>
+        <w:t xml:space="preserve"> </w:t>
       </w:r>
     </w:p>
     <w:p ns2:paraId="3F76DDBB" ns2:textId="77777777">
@@ -780,7 +811,13 @@
         <w:ind w:right="0" w:hanging="360"/>
       </w:pPr>
       <w:r>
-        <w:t xml:space="preserve">Wireless Network Planners and Operators: </w:t>
+        <w:rPr>
+          <w:b/>
+        </w:rPr>
+        <w:t xml:space="preserve">Wireless Network Planners and Operators:</w:t>
+      </w:r>
+      <w:r>
+        <w:t xml:space="preserve"> </w:t>
       </w:r>
     </w:p>
     <w:p ns2:paraId="032AE4B4" ns2:textId="77777777">
@@ -819,7 +856,13 @@
         <w:ind w:right="0" w:hanging="360"/>
       </w:pPr>
       <w:r>
-        <w:t xml:space="preserve">IoT (Internet of Things) Application Developers: </w:t>
+        <w:rPr>
+          <w:b/>
+        </w:rPr>
+        <w:t xml:space="preserve">IoT (Internet of Things) Application Developers:</w:t>
+      </w:r>
+      <w:r>
+        <w:t xml:space="preserve"> </w:t>
       </w:r>
     </w:p>
     <w:p ns2:paraId="6D6792EE" ns2:textId="77777777">
@@ -889,16 +932,16 @@
         <w:ind w:left="-5" w:right="0"/>
       </w:pPr>
       <w:r>
-        <w:t>5)</w:t>
-      </w:r>
-      <w:r>
-        <w:rPr>
-          <w:rFonts w:ascii="Arial" w:eastAsia="Arial" w:hAnsi="Arial" w:cs="Arial"/>
-        </w:rPr>
-        <w:t xml:space="preserve"> </w:t>
-      </w:r>
-      <w:r>
-        <w:t xml:space="preserve">Signal Analysis and RF Engineers: </w:t>
+        <w:t xml:space="preserve">5) </w:t>
+      </w:r>
+      <w:r>
+        <w:rPr>
+          <w:b/>
+        </w:rPr>
+        <w:t xml:space="preserve">Signal Analysis and RF Engineers:</w:t>
+      </w:r>
+      <w:r>
+        <w:t xml:space="preserve"> </w:t>
       </w:r>
     </w:p>
     <w:p ns2:paraId="2AC7FA26" ns2:textId="77777777">
@@ -1025,6 +1068,7 @@
     </w:p>
     <w:p ns2:paraId="08F5F45D" ns2:textId="77777777">
       <w:pPr>
+        <w:pStyle w:val="Heading3"/>
         <w:spacing w:after="0" w:line="259" w:lineRule="auto"/>
         <w:ind w:left="-5" w:right="0"/>
         <w:jc w:val="left"/>
@@ -1078,6 +1122,7 @@
     </w:p>
     <w:p ns2:paraId="4F9FF3F7" ns2:textId="77777777">
       <w:pPr>
+        <w:pStyle w:val="Heading3"/>
         <w:spacing w:after="0" w:line="259" w:lineRule="auto"/>
         <w:ind w:left="-5" w:right="0"/>
         <w:jc w:val="left"/>
@@ -1131,6 +1176,7 @@
     </w:p>
     <w:p ns2:paraId="1479DEE5" ns2:textId="77777777">
       <w:pPr>
+        <w:pStyle w:val="Heading3"/>
         <w:spacing w:after="0" w:line="259" w:lineRule="auto"/>
         <w:ind w:left="-5" w:right="0"/>
         <w:jc w:val="left"/>
@@ -1176,6 +1222,7 @@
     </w:p>
     <w:p ns2:paraId="26E37737" ns2:textId="77777777">
       <w:pPr>
+        <w:pStyle w:val="Heading3"/>
         <w:spacing w:after="0" w:line="259" w:lineRule="auto"/>
         <w:ind w:left="-5" w:right="0"/>
         <w:jc w:val="left"/>
@@ -1229,6 +1276,7 @@
     </w:p>
     <w:p ns2:paraId="402C5DED" ns2:textId="77777777">
       <w:pPr>
+        <w:pStyle w:val="Heading3"/>
         <w:spacing w:after="0" w:line="259" w:lineRule="auto"/>
         <w:ind w:left="-5" w:right="0"/>
         <w:jc w:val="left"/>
@@ -1318,6 +1366,7 @@
     </w:p>
     <w:p ns2:paraId="31D5D240" ns2:textId="77777777">
       <w:pPr>
+        <w:pStyle w:val="Heading3"/>
         <w:spacing w:after="0" w:line="259" w:lineRule="auto"/>
         <w:ind w:left="-5" w:right="0"/>
         <w:jc w:val="left"/>
@@ -1372,6 +1421,7 @@
     </w:p>
     <w:p ns2:paraId="037ED978" ns2:textId="77777777">
       <w:pPr>
+        <w:pStyle w:val="Heading3"/>
         <w:spacing w:after="0" w:line="259" w:lineRule="auto"/>
         <w:ind w:left="-5" w:right="0"/>
         <w:jc w:val="left"/>
@@ -1417,6 +1467,7 @@
     </w:p>
     <w:p ns2:paraId="4F4A14B8" ns2:textId="77777777">
       <w:pPr>
+        <w:pStyle w:val="Heading3"/>
         <w:spacing w:after="0" w:line="259" w:lineRule="auto"/>
         <w:ind w:left="-5" w:right="0"/>
         <w:jc w:val="left"/>
@@ -1471,6 +1522,7 @@
     </w:p>
     <w:p ns2:paraId="590D8024" ns2:textId="77777777">
       <w:pPr>
+        <w:pStyle w:val="Heading3"/>
         <w:spacing w:after="0" w:line="259" w:lineRule="auto"/>
         <w:ind w:left="-5" w:right="0"/>
         <w:jc w:val="left"/>
@@ -1537,11 +1589,21 @@
         <w:ind w:left="-5" w:right="0"/>
       </w:pPr>
       <w:r>
-        <w:t xml:space="preserve">Based on the specified transmitters and receivers, the "Plot Ideal Coverage" button creates the optimum coverage area. It assesses if receivers are within range and graphically indicates the coverage region. </w:t>
+        <w:t xml:space="preserve">Based on the specified transmitters and receivers, the "</w:t>
+      </w:r>
+      <w:r>
+        <w:rPr>
+          <w:b/>
+        </w:rPr>
+        <w:t xml:space="preserve">Plot Ideal Coverage</w:t>
+      </w:r>
+      <w:r>
+        <w:t xml:space="preserve">" button creates the optimum coverage area. It assesses if receivers are within range and graphically indicates the coverage region. </w:t>
       </w:r>
     </w:p>
     <w:p ns2:paraId="5DA85946" ns2:textId="77777777">
       <w:pPr>
+        <w:pStyle w:val="Heading3"/>
         <w:spacing w:after="0" w:line="259" w:lineRule="auto"/>
         <w:ind w:left="-5" w:right="0"/>
         <w:jc w:val="left"/>
@@ -1587,6 +1649,7 @@
     </w:p>
     <w:p ns2:paraId="4340A1B8" ns2:textId="77777777">
       <w:pPr>
+        <w:pStyle w:val="Heading3"/>
         <w:spacing w:after="0" w:line="259" w:lineRule="auto"/>
         <w:ind w:left="-5" w:right="0"/>
         <w:jc w:val="left"/>
@@ -1636,7 +1699,16 @@
         <w:ind w:left="-5" w:right="0"/>
       </w:pPr>
       <w:r>
-        <w:t xml:space="preserve">The "Generate Random Sites" button generates random sites inside the target region using the chosen grid size. </w:t>
+        <w:t xml:space="preserve">The "</w:t>
+      </w:r>
+      <w:r>
+        <w:rPr>
+          <w:b/>
+        </w:rPr>
+        <w:t xml:space="preserve">Generate Random Sites</w:t>
+      </w:r>
+      <w:r>
+        <w:t xml:space="preserve">" button generates random sites inside the target region using the chosen grid size. </w:t>
       </w:r>
     </w:p>
     <w:p ns2:paraId="34959B7C" ns2:textId="77777777">
@@ -1645,7 +1717,16 @@
         <w:ind w:left="-5" w:right="0"/>
       </w:pPr>
       <w:r>
-        <w:t xml:space="preserve">By choosing certain sites from a drop-down menu and pressing the "Visualize Coverage Area" button, users may view specific sites. This shows the coverage area while accounting for impediments like buildings. </w:t>
+        <w:t xml:space="preserve">By choosing certain sites from a drop-down menu and pressing the "</w:t>
+      </w:r>
+      <w:r>
+        <w:rPr>
+          <w:b/>
+        </w:rPr>
+        <w:t xml:space="preserve">Visualize Coverage Area</w:t>
+      </w:r>
+      <w:r>
+        <w:t xml:space="preserve">" button, users may view specific sites. This shows the coverage area while accounting for impediments like buildings. </w:t>
       </w:r>
     </w:p>
     <w:p ns2:paraId="6A7AB3EB" ns2:textId="77777777">
@@ -1654,11 +1735,21 @@
         <w:ind w:left="-5" w:right="0"/>
       </w:pPr>
       <w:r>
-        <w:t xml:space="preserve">Based on the specified grid, the "Generate Heat Map" button creates a heatmap showing the coverage regions. </w:t>
+        <w:t xml:space="preserve">Based on the specified grid, the "</w:t>
+      </w:r>
+      <w:r>
+        <w:rPr>
+          <w:b/>
+        </w:rPr>
+        <w:t xml:space="preserve">Generate Heat Map</w:t>
+      </w:r>
+      <w:r>
+        <w:t xml:space="preserve">" button creates a heatmap showing the coverage regions. </w:t>
       </w:r>
     </w:p>
     <w:p ns2:paraId="00553057" ns2:textId="77777777">
       <w:pPr>
+        <w:pStyle w:val="Heading3"/>
         <w:spacing w:after="0" w:line="259" w:lineRule="auto"/>
         <w:ind w:left="-5" w:right="0"/>
         <w:jc w:val="left"/>
@@ -1699,7 +1790,16 @@
         <w:ind w:left="-5" w:right="0"/>
       </w:pPr>
       <w:r>
-        <w:t xml:space="preserve">The process of downloading the heat maps and power distribution CSV files for each transmitter site begins when the "Save Files" button is clicked. </w:t>
+        <w:t xml:space="preserve">The process of downloading the heat maps and power distribution CSV files for each transmitter site begins when the "</w:t>
+      </w:r>
+      <w:r>
+        <w:rPr>
+          <w:b/>
+        </w:rPr>
+        <w:t xml:space="preserve">Save Files</w:t>
+      </w:r>
+      <w:r>
+        <w:t xml:space="preserve">" button is clicked. </w:t>
       </w:r>
     </w:p>
     <w:p ns2:paraId="753FD454" ns2:textId="77777777">
@@ -1763,45 +1863,54 @@
         <w:spacing w:after="118"/>
         <w:ind w:left="-5" w:right="0"/>
       </w:pPr>
-      <w:r>
-        <w:t xml:space="preserve">The system uses a mix of the </w:t>
-      </w:r>
       <w:proofErr w:type="spellStart"/>
       <w:proofErr w:type="gramStart"/>
-      <w:r>
-        <w:t>geoaxes</w:t>
-      </w:r>
       <w:proofErr w:type="spellEnd"/>
-      <w:r>
-        <w:t>(</w:t>
-      </w:r>
       <w:proofErr w:type="gramEnd"/>
-      <w:r>
-        <w:t xml:space="preserve">), </w:t>
-      </w:r>
       <w:proofErr w:type="spellStart"/>
-      <w:r>
-        <w:t>geoplot</w:t>
-      </w:r>
       <w:proofErr w:type="spellEnd"/>
-      <w:r>
-        <w:t xml:space="preserve">(), and </w:t>
-      </w:r>
       <w:proofErr w:type="spellStart"/>
-      <w:r>
-        <w:t>geobasemap</w:t>
-      </w:r>
       <w:proofErr w:type="spellEnd"/>
-      <w:r>
-        <w:t xml:space="preserve">() methods when the user inputs the coordinates and clicks the "Plot Target Region" button. Figure 1 gives the </w:t>
-      </w:r>
       <w:proofErr w:type="gramStart"/>
-      <w:r>
-        <w:t>glimpse</w:t>
-      </w:r>
       <w:proofErr w:type="gramEnd"/>
       <w:r>
-        <w:t xml:space="preserve"> when complete target region is plotted in the map panel. </w:t>
+        <w:t xml:space="preserve">The system uses a mix of the </w:t>
+      </w:r>
+      <w:r>
+        <w:rPr>
+          <w:b/>
+        </w:rPr>
+        <w:t xml:space="preserve">geoaxes()</w:t>
+      </w:r>
+      <w:r>
+        <w:t xml:space="preserve">, </w:t>
+      </w:r>
+      <w:r>
+        <w:rPr>
+          <w:b/>
+        </w:rPr>
+        <w:t xml:space="preserve">geoplot()</w:t>
+      </w:r>
+      <w:r>
+        <w:t xml:space="preserve">, and </w:t>
+      </w:r>
+      <w:r>
+        <w:rPr>
+          <w:b/>
+        </w:rPr>
+        <w:t xml:space="preserve">geobasemap()</w:t>
+      </w:r>
+      <w:r>
+        <w:t xml:space="preserve"> methods when the user inputs the coordinates and clicks the "</w:t>
+      </w:r>
+      <w:r>
+        <w:rPr>
+          <w:b/>
+        </w:rPr>
+        <w:t xml:space="preserve">Plot Target Region</w:t>
+      </w:r>
+      <w:r>
+        <w:t xml:space="preserve">" button. Figure 1 gives the glimpse when complete target region is plotted in the map panel. </w:t>
       </w:r>
     </w:p>
     <w:p ns2:paraId="599A1786" ns2:textId="77777777">
@@ -1869,6 +1978,7 @@
     </w:p>
     <w:p ns2:paraId="2253631B" ns2:textId="77777777">
       <w:pPr>
+        <w:pStyle w:val="Heading3"/>
         <w:spacing w:after="0" w:line="259" w:lineRule="auto"/>
         <w:ind w:left="-5" w:right="0"/>
         <w:jc w:val="left"/>
@@ -1951,6 +2061,7 @@
     </w:p>
     <w:p ns2:paraId="1876421C" ns2:textId="77777777">
       <w:pPr>
+        <w:pStyle w:val="Heading4"/>
         <w:tabs>
           <w:tab w:val="center" w:pos="1590"/>
         </w:tabs>
@@ -1987,6 +2098,7 @@
     </w:p>
     <w:p ns2:paraId="0BD2EA5E" ns2:textId="77777777">
       <w:pPr>
+        <w:pStyle w:val="Heading5"/>
         <w:spacing w:after="4" w:line="258" w:lineRule="auto"/>
         <w:ind w:left="-5" w:right="1450"/>
         <w:jc w:val="left"/>
@@ -2073,6 +2185,7 @@
     </w:p>
     <w:p ns2:paraId="01B2DA94" ns2:textId="77777777">
       <w:pPr>
+        <w:pStyle w:val="Heading5"/>
         <w:spacing w:after="4" w:line="258" w:lineRule="auto"/>
         <w:ind w:left="-5" w:right="1450"/>
         <w:jc w:val="left"/>
@@ -2783,6 +2896,7 @@
     </w:p>
     <w:p ns2:paraId="52865221" ns2:textId="77777777">
       <w:pPr>
+        <w:pStyle w:val="Heading5"/>
         <w:spacing w:after="4" w:line="258" w:lineRule="auto"/>
         <w:ind w:left="-5" w:right="1450"/>
         <w:jc w:val="left"/>
@@ -2905,6 +3019,7 @@
     </w:p>
     <w:p ns2:paraId="624D76A0" ns2:textId="77777777">
       <w:pPr>
+        <w:pStyle w:val="Heading3"/>
         <w:spacing w:after="0" w:line="259" w:lineRule="auto"/>
         <w:ind w:left="-5" w:right="0"/>
         <w:jc w:val="left"/>
@@ -3056,6 +3171,7 @@
     </w:p>
     <w:p ns2:paraId="021F86E0" ns2:textId="77777777">
       <w:pPr>
+        <w:pStyle w:val="Heading5"/>
         <w:spacing w:after="4" w:line="258" w:lineRule="auto"/>
         <w:ind w:left="-5" w:right="1450"/>
         <w:jc w:val="left"/>
@@ -3083,6 +3199,7 @@
     </w:p>
     <w:p ns2:paraId="440A43A3" ns2:textId="77777777">
       <w:pPr>
+        <w:pStyle w:val="Heading5"/>
         <w:spacing w:after="4" w:line="258" w:lineRule="auto"/>
         <w:ind w:left="-5" w:right="1450"/>
         <w:jc w:val="left"/>
@@ -3279,6 +3396,7 @@
     </w:p>
     <w:p ns2:paraId="58FB339D" ns2:textId="77777777">
       <w:pPr>
+        <w:pStyle w:val="Heading3"/>
         <w:spacing w:after="0" w:line="259" w:lineRule="auto"/>
         <w:ind w:left="-5" w:right="0"/>
         <w:jc w:val="left"/>
@@ -4145,6 +4263,7 @@
     </w:p>
     <w:p ns2:paraId="4490B3C4" ns2:textId="77777777">
       <w:pPr>
+        <w:pStyle w:val="Heading3"/>
         <w:spacing w:after="0" w:line="259" w:lineRule="auto"/>
         <w:ind w:left="-5" w:right="0"/>
         <w:jc w:val="left"/>
@@ -4671,25 +4790,26 @@
       <w:pPr>
         <w:ind w:left="-5" w:right="0"/>
       </w:pPr>
-      <w:r>
-        <w:t xml:space="preserve">The data passed through these fields will be treated as argument for the function </w:t>
-      </w:r>
       <w:proofErr w:type="spellStart"/>
       <w:proofErr w:type="gramStart"/>
-      <w:r>
-        <w:t>txsite</w:t>
-      </w:r>
       <w:proofErr w:type="spellEnd"/>
-      <w:r>
-        <w:t>(</w:t>
-      </w:r>
       <w:proofErr w:type="gramEnd"/>
       <w:r>
-        <w:t xml:space="preserve">). </w:t>
+        <w:t xml:space="preserve">The data passed through these fields will be treated as argument for the function </w:t>
+      </w:r>
+      <w:r>
+        <w:rPr>
+          <w:b/>
+        </w:rPr>
+        <w:t xml:space="preserve">txsite()</w:t>
+      </w:r>
+      <w:r>
+        <w:t xml:space="preserve">. </w:t>
       </w:r>
     </w:p>
     <w:p ns2:paraId="1982F966" ns2:textId="77777777">
       <w:pPr>
+        <w:pStyle w:val="Heading5"/>
         <w:ind w:left="-5" w:right="3826"/>
       </w:pPr>
       <w:r>
@@ -4730,6 +4850,7 @@
     </w:p>
     <w:p ns2:paraId="50A68190" ns2:textId="77777777">
       <w:pPr>
+        <w:pStyle w:val="Heading5"/>
         <w:spacing w:after="75" w:line="258" w:lineRule="auto"/>
         <w:ind w:left="-5" w:right="1450"/>
         <w:jc w:val="left"/>
@@ -5043,6 +5164,7 @@
     </w:p>
     <w:p ns2:paraId="6932CE42" ns2:textId="77777777">
       <w:pPr>
+        <w:pStyle w:val="Heading5"/>
         <w:spacing w:after="1" w:line="259" w:lineRule="auto"/>
         <w:ind w:left="-5" w:right="0"/>
         <w:jc w:val="left"/>
@@ -5460,25 +5582,26 @@
       <w:pPr>
         <w:ind w:left="-5" w:right="0"/>
       </w:pPr>
-      <w:r>
-        <w:t xml:space="preserve">The above mentioned values filled in these fields will act as an input for the function </w:t>
-      </w:r>
       <w:proofErr w:type="spellStart"/>
       <w:proofErr w:type="gramStart"/>
-      <w:r>
-        <w:t>rxsite</w:t>
-      </w:r>
       <w:proofErr w:type="spellEnd"/>
-      <w:r>
-        <w:t>(</w:t>
-      </w:r>
       <w:proofErr w:type="gramEnd"/>
       <w:r>
-        <w:t xml:space="preserve">). </w:t>
+        <w:t xml:space="preserve">The above mentioned values filled in these fields will act as an input for the function </w:t>
+      </w:r>
+      <w:r>
+        <w:rPr>
+          <w:b/>
+        </w:rPr>
+        <w:t xml:space="preserve">rxsite()</w:t>
+      </w:r>
+      <w:r>
+        <w:t xml:space="preserve">. </w:t>
       </w:r>
     </w:p>
     <w:p ns2:paraId="766B6889" ns2:textId="77777777">
       <w:pPr>
+        <w:pStyle w:val="Heading5"/>
         <w:spacing w:after="4" w:line="258" w:lineRule="auto"/>
         <w:ind w:left="-5" w:right="1450"/>
         <w:jc w:val="left"/>
@@ -5535,6 +5658,7 @@
     </w:p>
     <w:p ns2:paraId="4FF104E8" ns2:textId="77777777">
       <w:pPr>
+        <w:pStyle w:val="Heading5"/>
         <w:spacing w:after="75" w:line="258" w:lineRule="auto"/>
         <w:ind w:left="-5" w:right="1450"/>
         <w:jc w:val="left"/>
@@ -5898,6 +6022,7 @@
     </w:p>
     <w:p ns2:paraId="3A180D2A" ns2:textId="77777777">
       <w:pPr>
+        <w:pStyle w:val="Heading3"/>
         <w:spacing w:after="0" w:line="259" w:lineRule="auto"/>
         <w:ind w:left="-5" w:right="0"/>
         <w:jc w:val="left"/>
@@ -8019,6 +8144,7 @@
     </w:p>
     <w:p ns2:paraId="4F55FE8E" ns2:textId="77777777">
       <w:pPr>
+        <w:pStyle w:val="Heading3"/>
         <w:spacing w:after="0" w:line="259" w:lineRule="auto"/>
         <w:ind w:left="-5" w:right="0"/>
         <w:jc w:val="left"/>
@@ -8073,6 +8199,7 @@
     </w:p>
     <w:p ns2:paraId="436758AE" ns2:textId="77777777">
       <w:pPr>
+        <w:pStyle w:val="Heading3"/>
         <w:spacing w:after="0" w:line="259" w:lineRule="auto"/>
         <w:ind w:left="-5" w:right="0"/>
         <w:jc w:val="left"/>
@@ -8102,48 +8229,63 @@
       <w:pPr>
         <w:ind w:left="-5" w:right="0"/>
       </w:pPr>
-      <w:r>
-        <w:t xml:space="preserve">A crucial component of the Swarm Properties panel is the depiction of the optimal coverage area. Users may estimate signal availability at various points within the target region by having a comprehensive grasp of the geographic range that the transmitter signals are anticipated to cover. By passing the </w:t>
-      </w:r>
       <w:proofErr w:type="spellStart"/>
-      <w:r>
-        <w:t>txsite</w:t>
-      </w:r>
       <w:proofErr w:type="spellEnd"/>
+      <w:proofErr w:type="spellStart"/>
+      <w:proofErr w:type="spellEnd"/>
+      <w:proofErr w:type="gramStart"/>
+      <w:proofErr w:type="gramEnd"/>
+      <w:proofErr w:type="gramStart"/>
+      <w:proofErr w:type="gramEnd"/>
+      <w:proofErr w:type="spellStart"/>
+      <w:proofErr w:type="spellEnd"/>
+      <w:r>
+        <w:t xml:space="preserve">A crucial component of the Swarm Properties panel is the depiction of the optimal coverage area. Users may estimate signal availability at various points within the target region by having a comprehensive grasp of the geographic range that the transmitter signals are anticipated to cover. By passing the txsite and rxsite as inputs, the </w:t>
+      </w:r>
+      <w:r>
+        <w:rPr>
+          <w:b/>
+        </w:rPr>
+        <w:t xml:space="preserve">coverage()</w:t>
+      </w:r>
+      <w:r>
+        <w:t xml:space="preserve"> function is used to carry out this process, and the </w:t>
+      </w:r>
+      <w:r>
+        <w:rPr>
+          <w:b/>
+        </w:rPr>
+        <w:t xml:space="preserve">link()</w:t>
+      </w:r>
+      <w:r>
+        <w:t xml:space="preserve"> function is used to draw the linkages between the transmitters and receivers. The implementation of the </w:t>
+      </w:r>
+      <w:r>
+        <w:rPr>
+          <w:b/>
+        </w:rPr>
+        <w:t xml:space="preserve">coverage()</w:t>
+      </w:r>
       <w:r>
         <w:t xml:space="preserve"> and </w:t>
       </w:r>
-      <w:proofErr w:type="spellStart"/>
-      <w:r>
-        <w:t>rxsite</w:t>
-      </w:r>
-      <w:proofErr w:type="spellEnd"/>
-      <w:r>
-        <w:t xml:space="preserve"> as inputs, the </w:t>
-      </w:r>
-      <w:proofErr w:type="gramStart"/>
-      <w:r>
-        <w:t>coverage(</w:t>
-      </w:r>
-      <w:proofErr w:type="gramEnd"/>
-      <w:r>
-        <w:t xml:space="preserve">) function is used to carry out this process, and the link() function is used to draw the linkages between the transmitters and receivers. The implementation of the </w:t>
-      </w:r>
-      <w:proofErr w:type="gramStart"/>
-      <w:r>
-        <w:t>coverage(</w:t>
-      </w:r>
-      <w:proofErr w:type="gramEnd"/>
-      <w:r>
-        <w:t xml:space="preserve">) and link() functions is based on the </w:t>
-      </w:r>
-      <w:proofErr w:type="spellStart"/>
-      <w:r>
-        <w:t>siteviewer</w:t>
-      </w:r>
-      <w:proofErr w:type="spellEnd"/>
-      <w:r>
-        <w:t xml:space="preserve">() function. Details for each function are provided below. </w:t>
+      <w:r>
+        <w:rPr>
+          <w:b/>
+        </w:rPr>
+        <w:t xml:space="preserve">link()</w:t>
+      </w:r>
+      <w:r>
+        <w:t xml:space="preserve"> functions is based on the </w:t>
+      </w:r>
+      <w:r>
+        <w:rPr>
+          <w:b/>
+        </w:rPr>
+        <w:t xml:space="preserve">siteviewer()</w:t>
+      </w:r>
+      <w:r>
+        <w:t xml:space="preserve"> function. Details for each function are provided below. </w:t>
       </w:r>
     </w:p>
     <w:p ns2:paraId="1F129A2F" ns2:textId="77777777">
@@ -8238,16 +8380,19 @@
       <w:pPr>
         <w:ind w:left="-5" w:right="0"/>
       </w:pPr>
+      <w:proofErr w:type="gramStart"/>
+      <w:proofErr w:type="gramEnd"/>
       <w:r>
         <w:t xml:space="preserve">In the current Site Viewer, </w:t>
       </w:r>
-      <w:proofErr w:type="gramStart"/>
-      <w:r>
-        <w:t>coverage(</w:t>
-      </w:r>
-      <w:proofErr w:type="gramEnd"/>
-      <w:r>
-        <w:t xml:space="preserve">) shows the coverage map for the chosen transmitter site. Each colored contour on the map represents a region where the mobile receiver receives the matching signal strength [7]. </w:t>
+      <w:r>
+        <w:rPr>
+          <w:b/>
+        </w:rPr>
+        <w:t xml:space="preserve">coverage()</w:t>
+      </w:r>
+      <w:r>
+        <w:t xml:space="preserve"> shows the coverage map for the chosen transmitter site. Each colored contour on the map represents a region where the mobile receiver receives the matching signal strength [7]. </w:t>
       </w:r>
     </w:p>
     <w:p ns2:paraId="536D32B4" ns2:textId="77777777">
@@ -8279,6 +8424,7 @@
     </w:p>
     <w:p ns2:paraId="1F3F082C" ns2:textId="77777777">
       <w:pPr>
+        <w:pStyle w:val="Heading5"/>
         <w:spacing w:after="4" w:line="258" w:lineRule="auto"/>
         <w:ind w:left="-5" w:right="1450"/>
         <w:jc w:val="left"/>
@@ -8305,29 +8451,23 @@
       <w:pPr>
         <w:ind w:left="-5" w:right="0"/>
       </w:pPr>
-      <w:r>
-        <w:t xml:space="preserve">The </w:t>
-      </w:r>
       <w:proofErr w:type="spellStart"/>
       <w:proofErr w:type="gramStart"/>
-      <w:r>
-        <w:t>txsite</w:t>
-      </w:r>
       <w:proofErr w:type="spellEnd"/>
-      <w:r>
-        <w:t>(</w:t>
-      </w:r>
       <w:proofErr w:type="gramEnd"/>
-      <w:r>
-        <w:t xml:space="preserve">) function object, which denotes the transmitter locations, is expected as a parameter. Using an array technology, many transmitter locations may be provided. An array can include several </w:t>
-      </w:r>
       <w:proofErr w:type="spellStart"/>
-      <w:r>
-        <w:t>txsite</w:t>
-      </w:r>
       <w:proofErr w:type="spellEnd"/>
       <w:r>
-        <w:t xml:space="preserve"> objects, and that array can be provided as a parameter [7]. </w:t>
+        <w:t xml:space="preserve">The </w:t>
+      </w:r>
+      <w:r>
+        <w:rPr>
+          <w:b/>
+        </w:rPr>
+        <w:t xml:space="preserve">txsite()</w:t>
+      </w:r>
+      <w:r>
+        <w:t xml:space="preserve"> function object, which denotes the transmitter locations, is expected as a parameter. Using an array technology, many transmitter locations may be provided. An array can include several txsite objects, and that array can be provided as a parameter [7]. </w:t>
       </w:r>
     </w:p>
     <w:p ns2:paraId="596B533C" ns2:textId="77777777">
@@ -8357,21 +8497,21 @@
       <w:pPr>
         <w:ind w:left="-5" w:right="0"/>
       </w:pPr>
-      <w:r>
-        <w:t xml:space="preserve">The </w:t>
-      </w:r>
       <w:proofErr w:type="spellStart"/>
       <w:proofErr w:type="gramStart"/>
-      <w:r>
-        <w:t>rxsite</w:t>
-      </w:r>
       <w:proofErr w:type="spellEnd"/>
-      <w:r>
-        <w:t>(</w:t>
-      </w:r>
       <w:proofErr w:type="gramEnd"/>
       <w:r>
-        <w:t xml:space="preserve">) function object, which represents the receivers' sites, is expected as an argument. Additionally, an array of receiver site objects can be supplied as an argument if several receivers need to be passed [7]. </w:t>
+        <w:t xml:space="preserve">The </w:t>
+      </w:r>
+      <w:r>
+        <w:rPr>
+          <w:b/>
+        </w:rPr>
+        <w:t xml:space="preserve">rxsite()</w:t>
+      </w:r>
+      <w:r>
+        <w:t xml:space="preserve"> function object, which represents the receivers' sites, is expected as an argument. Additionally, an array of receiver site objects can be supplied as an argument if several receivers need to be passed [7]. </w:t>
       </w:r>
     </w:p>
     <w:p ns2:paraId="0F3E9CBE" ns2:textId="77777777">
@@ -8899,33 +9039,28 @@
       <w:pPr>
         <w:ind w:left="-5" w:right="0"/>
       </w:pPr>
-      <w:r>
-        <w:t xml:space="preserve">This argument expects the </w:t>
-      </w:r>
       <w:proofErr w:type="spellStart"/>
       <w:proofErr w:type="gramStart"/>
-      <w:r>
-        <w:t>rxsite</w:t>
-      </w:r>
       <w:proofErr w:type="spellEnd"/>
-      <w:r>
-        <w:t>(</w:t>
-      </w:r>
       <w:proofErr w:type="gramEnd"/>
-      <w:r>
-        <w:t xml:space="preserve">) function object, which signifies the receivers sites. Moreover, if multiple receivers need to be passed, then </w:t>
-      </w:r>
       <w:proofErr w:type="gramStart"/>
-      <w:r>
-        <w:t>array</w:t>
-      </w:r>
       <w:proofErr w:type="gramEnd"/>
       <w:r>
-        <w:t xml:space="preserve"> of receiver site object can be passed as an argument [8]. </w:t>
+        <w:t xml:space="preserve">This argument expects the </w:t>
+      </w:r>
+      <w:r>
+        <w:rPr>
+          <w:b/>
+        </w:rPr>
+        <w:t xml:space="preserve">rxsite()</w:t>
+      </w:r>
+      <w:r>
+        <w:t xml:space="preserve"> function object, which signifies the receivers sites. Moreover, if multiple receivers need to be passed, then array of receiver site object can be passed as an argument [8]. </w:t>
       </w:r>
     </w:p>
     <w:p ns2:paraId="511C40FC" ns2:textId="77777777">
       <w:pPr>
+        <w:pStyle w:val="Heading5"/>
         <w:spacing w:after="4" w:line="258" w:lineRule="auto"/>
         <w:ind w:left="-5" w:right="1450"/>
         <w:jc w:val="left"/>
@@ -8952,42 +9087,30 @@
       <w:pPr>
         <w:ind w:left="-5" w:right="0"/>
       </w:pPr>
-      <w:r>
-        <w:lastRenderedPageBreak/>
-        <w:t xml:space="preserve">This argument expects the </w:t>
-      </w:r>
       <w:proofErr w:type="spellStart"/>
       <w:proofErr w:type="gramStart"/>
-      <w:r>
-        <w:t>txsite</w:t>
-      </w:r>
       <w:proofErr w:type="spellEnd"/>
-      <w:r>
-        <w:t>(</w:t>
-      </w:r>
       <w:proofErr w:type="gramEnd"/>
-      <w:r>
-        <w:t xml:space="preserve">) function object, which signifies the transmitter sites. To give multiple </w:t>
-      </w:r>
       <w:proofErr w:type="gramStart"/>
-      <w:r>
-        <w:t>transmitter</w:t>
-      </w:r>
       <w:proofErr w:type="gramEnd"/>
-      <w:r>
-        <w:t xml:space="preserve"> sites, array methodology can be used. Multiple </w:t>
-      </w:r>
       <w:proofErr w:type="spellStart"/>
-      <w:r>
-        <w:t>txsite</w:t>
-      </w:r>
       <w:proofErr w:type="spellEnd"/>
       <w:r>
-        <w:t xml:space="preserve"> objects can be added to an array, and that array can be passed as argument [8]. </w:t>
+        <w:t xml:space="preserve">This argument expects the </w:t>
+      </w:r>
+      <w:r>
+        <w:rPr>
+          <w:b/>
+        </w:rPr>
+        <w:t xml:space="preserve">txsite()</w:t>
+      </w:r>
+      <w:r>
+        <w:t xml:space="preserve"> function object, which signifies the transmitter sites. To give multiple transmitter sites, array methodology can be used. Multiple txsite objects can be added to an array, and that array can be passed as argument [8]. </w:t>
       </w:r>
     </w:p>
     <w:p ns2:paraId="4DE6E659" ns2:textId="77777777">
       <w:pPr>
+        <w:pStyle w:val="Heading5"/>
         <w:spacing w:line="258" w:lineRule="auto"/>
         <w:ind w:left="-5" w:right="1450"/>
         <w:jc w:val="left"/>
@@ -9012,6 +9135,7 @@
     </w:p>
     <w:p ns2:paraId="2E1FB8DA" ns2:textId="77777777">
       <w:pPr>
+        <w:pStyle w:val="Heading5"/>
         <w:spacing w:after="4" w:line="258" w:lineRule="auto"/>
         <w:ind w:left="-5" w:right="1450"/>
         <w:jc w:val="left"/>
@@ -9404,6 +9528,7 @@
     </w:p>
     <w:p ns2:paraId="7ECCFC4A" ns2:textId="77777777">
       <w:pPr>
+        <w:pStyle w:val="Heading3"/>
         <w:spacing w:after="0" w:line="259" w:lineRule="auto"/>
         <w:ind w:left="-5" w:right="0"/>
         <w:jc w:val="left"/>
@@ -9540,6 +9665,7 @@
     </w:p>
     <w:p ns2:paraId="6D7A6612" ns2:textId="77777777">
       <w:pPr>
+        <w:pStyle w:val="Heading5"/>
         <w:ind w:left="-5" w:right="1691"/>
       </w:pPr>
       <w:r>
@@ -9655,21 +9781,21 @@
       <w:pPr>
         <w:ind w:left="-5" w:right="0"/>
       </w:pPr>
-      <w:r>
-        <w:t xml:space="preserve">It is imposed on the transmitter's coverage area based on the directivity array returned by the </w:t>
-      </w:r>
       <w:proofErr w:type="spellStart"/>
       <w:proofErr w:type="gramStart"/>
-      <w:r>
-        <w:t>patternAzimuth</w:t>
-      </w:r>
       <w:proofErr w:type="spellEnd"/>
-      <w:r>
-        <w:t>(</w:t>
-      </w:r>
       <w:proofErr w:type="gramEnd"/>
       <w:r>
-        <w:t xml:space="preserve">) function. The coverage area of the transmitter is also impacted by the directivity pattern. The directivity pattern is taken into consideration when the coverage area is displayed on the map interface to represent the differences in signal strength in various directions. The directivity pattern of the antenna may cause the coverage area to take on erratic forms or fluctuations. The same coverage and connection functions that were previously described were used to create the graphic. Figure 4 shows how the coverage area changes based on the directivity pattern. </w:t>
+        <w:t xml:space="preserve">It is imposed on the transmitter's coverage area based on the directivity array returned by the </w:t>
+      </w:r>
+      <w:r>
+        <w:rPr>
+          <w:b/>
+        </w:rPr>
+        <w:t xml:space="preserve">patternAzimuth()</w:t>
+      </w:r>
+      <w:r>
+        <w:t xml:space="preserve"> function. The coverage area of the transmitter is also impacted by the directivity pattern. The directivity pattern is taken into consideration when the coverage area is displayed on the map interface to represent the differences in signal strength in various directions. The directivity pattern of the antenna may cause the coverage area to take on erratic forms or fluctuations. The same coverage and connection functions that were previously described were used to create the graphic. Figure 4 shows how the coverage area changes based on the directivity pattern. </w:t>
       </w:r>
     </w:p>
     <w:p ns2:paraId="7355A717" ns2:textId="77777777">
@@ -10001,6 +10127,7 @@
     </w:p>
     <w:p ns2:paraId="64278E9A" ns2:textId="77777777">
       <w:pPr>
+        <w:pStyle w:val="Heading3"/>
         <w:spacing w:after="53" w:line="259" w:lineRule="auto"/>
         <w:ind w:left="-5" w:right="0"/>
         <w:jc w:val="left"/>
@@ -10279,6 +10406,7 @@
     </w:p>
     <w:p ns2:paraId="0515E16E" ns2:textId="77777777">
       <w:pPr>
+        <w:pStyle w:val="Heading4"/>
         <w:tabs>
           <w:tab w:val="center" w:pos="1143"/>
         </w:tabs>
@@ -10341,6 +10469,7 @@
     </w:p>
     <w:p ns2:paraId="1DA38860" ns2:textId="77777777">
       <w:pPr>
+        <w:pStyle w:val="Heading3"/>
         <w:spacing w:after="0" w:line="259" w:lineRule="auto"/>
         <w:ind w:left="-5" w:right="0"/>
         <w:jc w:val="left"/>
@@ -10372,28 +10501,37 @@
         <w:ind w:left="-5" w:right="0"/>
       </w:pPr>
       <w:r>
-        <w:t xml:space="preserve">The "Generate Random Sites" button is clicked by users to start the generating process. </w:t>
+        <w:t xml:space="preserve">The "</w:t>
+      </w:r>
+      <w:r>
+        <w:rPr>
+          <w:b/>
+        </w:rPr>
+        <w:t xml:space="preserve">Generate Random Sites</w:t>
+      </w:r>
+      <w:r>
+        <w:t xml:space="preserve">" button is clicked by users to start the generating process. </w:t>
       </w:r>
     </w:p>
     <w:p ns2:paraId="763EC39C" ns2:textId="77777777">
       <w:pPr>
         <w:ind w:left="-5" w:right="0"/>
       </w:pPr>
-      <w:r>
-        <w:t xml:space="preserve">Within each grid cell of the target zone, the program creates transmitter sites using the parameters that have been supplied. The transmitter sites' coordinates are based on the centroid of each. The signal strength for each cell's centroid is calculated using the </w:t>
-      </w:r>
       <w:proofErr w:type="spellStart"/>
       <w:proofErr w:type="gramStart"/>
-      <w:r>
-        <w:t>signalStrength</w:t>
-      </w:r>
       <w:proofErr w:type="spellEnd"/>
-      <w:r>
-        <w:t>(</w:t>
-      </w:r>
       <w:proofErr w:type="gramEnd"/>
       <w:r>
-        <w:t xml:space="preserve">) method. It is anticipated that the cell's centroid will get the same amount of electricity as the rest of the cell. </w:t>
+        <w:t xml:space="preserve">Within each grid cell of the target zone, the program creates transmitter sites using the parameters that have been supplied. The transmitter sites' coordinates are based on the centroid of each. The signal strength for each cell's centroid is calculated using the </w:t>
+      </w:r>
+      <w:r>
+        <w:rPr>
+          <w:b/>
+        </w:rPr>
+        <w:t xml:space="preserve">signalStrength()</w:t>
+      </w:r>
+      <w:r>
+        <w:t xml:space="preserve"> method. It is anticipated that the cell's centroid will get the same amount of electricity as the rest of the cell. </w:t>
       </w:r>
     </w:p>
     <w:p ns2:paraId="60E32451" ns2:textId="77777777">
@@ -10503,25 +10641,26 @@
       <w:pPr>
         <w:ind w:left="-5" w:right="0"/>
       </w:pPr>
-      <w:r>
-        <w:t xml:space="preserve">The </w:t>
-      </w:r>
       <w:proofErr w:type="spellStart"/>
       <w:proofErr w:type="gramStart"/>
-      <w:r>
-        <w:t>rxsite</w:t>
-      </w:r>
       <w:proofErr w:type="spellEnd"/>
-      <w:r>
-        <w:t>(</w:t>
-      </w:r>
       <w:proofErr w:type="gramEnd"/>
       <w:r>
-        <w:t xml:space="preserve">) function object, which represents the receivers' sites, is expected as an argument. Additionally, an array of receiver site objects can be supplied as an argument if several receivers need to be passed [10]. </w:t>
+        <w:t xml:space="preserve">The </w:t>
+      </w:r>
+      <w:r>
+        <w:rPr>
+          <w:b/>
+        </w:rPr>
+        <w:t xml:space="preserve">rxsite()</w:t>
+      </w:r>
+      <w:r>
+        <w:t xml:space="preserve"> function object, which represents the receivers' sites, is expected as an argument. Additionally, an array of receiver site objects can be supplied as an argument if several receivers need to be passed [10]. </w:t>
       </w:r>
     </w:p>
     <w:p ns2:paraId="03FEA78A" ns2:textId="77777777">
       <w:pPr>
+        <w:pStyle w:val="Heading5"/>
         <w:spacing w:after="4" w:line="258" w:lineRule="auto"/>
         <w:ind w:left="-5" w:right="1450"/>
         <w:jc w:val="left"/>
@@ -10548,33 +10687,28 @@
       <w:pPr>
         <w:ind w:left="-5" w:right="0"/>
       </w:pPr>
-      <w:r>
-        <w:t xml:space="preserve">The </w:t>
-      </w:r>
       <w:proofErr w:type="spellStart"/>
       <w:proofErr w:type="gramStart"/>
-      <w:r>
-        <w:t>txsite</w:t>
-      </w:r>
       <w:proofErr w:type="spellEnd"/>
-      <w:r>
-        <w:t>(</w:t>
-      </w:r>
       <w:proofErr w:type="gramEnd"/>
-      <w:r>
-        <w:t xml:space="preserve">) function object, which denotes the transmitter locations, is expected as a parameter. Using an array technology, many transmitter locations may be provided. An array can include several </w:t>
-      </w:r>
       <w:proofErr w:type="spellStart"/>
-      <w:r>
-        <w:t>txsite</w:t>
-      </w:r>
       <w:proofErr w:type="spellEnd"/>
       <w:r>
-        <w:t xml:space="preserve"> objects, and that array can be provided as a parameter [10]. </w:t>
+        <w:t xml:space="preserve">The </w:t>
+      </w:r>
+      <w:r>
+        <w:rPr>
+          <w:b/>
+        </w:rPr>
+        <w:t xml:space="preserve">txsite()</w:t>
+      </w:r>
+      <w:r>
+        <w:t xml:space="preserve"> function object, which denotes the transmitter locations, is expected as a parameter. Using an array technology, many transmitter locations may be provided. An array can include several txsite objects, and that array can be provided as a parameter [10]. </w:t>
       </w:r>
     </w:p>
     <w:p ns2:paraId="2A001629" ns2:textId="77777777">
       <w:pPr>
+        <w:pStyle w:val="Heading5"/>
         <w:spacing w:after="195" w:line="258" w:lineRule="auto"/>
         <w:ind w:left="-5" w:right="1450"/>
         <w:jc w:val="left"/>
@@ -10732,6 +10866,7 @@
     </w:p>
     <w:p ns2:paraId="6E4EAAD2" ns2:textId="77777777">
       <w:pPr>
+        <w:pStyle w:val="Heading3"/>
         <w:spacing w:after="0" w:line="259" w:lineRule="auto"/>
         <w:ind w:left="-5" w:right="0"/>
         <w:jc w:val="left"/>
@@ -10762,16 +10897,19 @@
         <w:spacing w:after="161"/>
         <w:ind w:left="-5" w:right="0"/>
       </w:pPr>
-      <w:r>
-        <w:t xml:space="preserve">The depiction of the coverage area gives information about the breadth and depth of signal coverage for each transmitter location. The coverage function in MATLAB, which makes use of the raytracing propagation model, is used to carry out this visualization. By selecting the "Visualize Coverage Area" option, the chosen transmitter site's coverage area is calculated and shown on the map. The coverage area utilizes the raytracing propagation model and </w:t>
-      </w:r>
       <w:proofErr w:type="gramStart"/>
-      <w:r>
-        <w:t>takes into account</w:t>
-      </w:r>
       <w:proofErr w:type="gramEnd"/>
       <w:r>
-        <w:t xml:space="preserve"> obstructions like buildings to calculate the signal reach. On the map interface, the coverage area is shown as a highlighted area or as a color gradient. An intuitive comprehension of the signal propagation range is provided by the visual depiction, which shows the size of the coverage region. </w:t>
+        <w:t xml:space="preserve">The depiction of the coverage area gives information about the breadth and depth of signal coverage for each transmitter location. The coverage function in MATLAB, which makes use of the raytracing propagation model, is used to carry out this visualization. By selecting the "</w:t>
+      </w:r>
+      <w:r>
+        <w:rPr>
+          <w:b/>
+        </w:rPr>
+        <w:t xml:space="preserve">Visualize Coverage Area</w:t>
+      </w:r>
+      <w:r>
+        <w:t xml:space="preserve">" option, the chosen transmitter site's coverage area is calculated and shown on the map. The coverage area utilizes the raytracing propagation model and takes into account obstructions like buildings to calculate the signal reach. On the map interface, the coverage area is shown as a highlighted area or as a color gradient. An intuitive comprehension of the signal propagation range is provided by the visual depiction, which shows the size of the coverage region. </w:t>
       </w:r>
     </w:p>
     <w:p ns2:paraId="179979E7" ns2:textId="77777777">
@@ -10855,6 +10993,7 @@
       </w:r>
       <w:r>
         <w:rPr>
+          <w:i/>
           <w:color w:val="44546A"/>
           <w:sz w:val="18"/>
         </w:rPr>
@@ -10863,6 +11002,7 @@
     </w:p>
     <w:p ns2:paraId="387D4D1D" ns2:textId="77777777">
       <w:pPr>
+        <w:pStyle w:val="Heading3"/>
         <w:spacing w:after="0" w:line="259" w:lineRule="auto"/>
         <w:ind w:left="-5" w:right="0"/>
         <w:jc w:val="left"/>
@@ -10893,21 +11033,21 @@
         <w:spacing w:after="161"/>
         <w:ind w:left="-5" w:right="0"/>
       </w:pPr>
-      <w:r>
-        <w:t xml:space="preserve">Based on the grid, heat map visualization offers a thorough picture of the signal intensity distribution over the target region. The </w:t>
-      </w:r>
       <w:proofErr w:type="spellStart"/>
       <w:proofErr w:type="gramStart"/>
-      <w:r>
-        <w:t>signalStrength</w:t>
-      </w:r>
       <w:proofErr w:type="spellEnd"/>
-      <w:r>
-        <w:t>(</w:t>
-      </w:r>
       <w:proofErr w:type="gramEnd"/>
       <w:r>
-        <w:t xml:space="preserve">) method in the program uses the grid cells and transmitter locations to determine the signal strength for each cell. The signal intensity distribution over the target region is shown on the heat map that was created. Different colors denote differing signal levels, and the signal strength values are represented using a color gradient or color coding. </w:t>
+        <w:t xml:space="preserve">Based on the grid, heat map visualization offers a thorough picture of the signal intensity distribution over the target region. The </w:t>
+      </w:r>
+      <w:r>
+        <w:rPr>
+          <w:b/>
+        </w:rPr>
+        <w:t xml:space="preserve">signalStrength()</w:t>
+      </w:r>
+      <w:r>
+        <w:t xml:space="preserve"> method in the program uses the grid cells and transmitter locations to determine the signal strength for each cell. The signal intensity distribution over the target region is shown on the heat map that was created. Different colors denote differing signal levels, and the signal strength values are represented using a color gradient or color coding. </w:t>
       </w:r>
     </w:p>
     <w:p ns2:paraId="4CCA3601" ns2:textId="77777777">
@@ -11077,6 +11217,7 @@
     </w:p>
     <w:p ns2:paraId="15B59A19" ns2:textId="77777777">
       <w:pPr>
+        <w:pStyle w:val="Heading3"/>
         <w:spacing w:after="0" w:line="259" w:lineRule="auto"/>
         <w:ind w:left="-5" w:right="0"/>
         <w:jc w:val="left"/>
@@ -11139,6 +11280,7 @@
     </w:p>
     <w:p ns2:paraId="35696730" ns2:textId="77777777">
       <w:pPr>
+        <w:pStyle w:val="Heading3"/>
         <w:spacing w:after="3" w:line="333" w:lineRule="auto"/>
         <w:ind w:left="-5" w:right="896"/>
         <w:jc w:val="left"/>
@@ -11169,6 +11311,7 @@
     </w:p>
     <w:p ns2:paraId="27A866D8" ns2:textId="77777777">
       <w:pPr>
+        <w:pStyle w:val="Heading3"/>
         <w:spacing w:after="49" w:line="356" w:lineRule="auto"/>
         <w:ind w:left="-5" w:right="834"/>
       </w:pPr>
@@ -11208,6 +11351,7 @@
     </w:p>
     <w:p ns2:paraId="3DBBA025" ns2:textId="77777777">
       <w:pPr>
+        <w:pStyle w:val="Heading3"/>
         <w:spacing w:after="0" w:line="259" w:lineRule="auto"/>
         <w:ind w:left="-5" w:right="0"/>
         <w:jc w:val="left"/>
@@ -11270,6 +11414,7 @@
     </w:p>
     <w:p ns2:paraId="2601A1CC" ns2:textId="77777777">
       <w:pPr>
+        <w:pStyle w:val="Heading3"/>
         <w:spacing w:after="0" w:line="259" w:lineRule="auto"/>
         <w:ind w:left="-5" w:right="0"/>
         <w:jc w:val="left"/>
@@ -11355,6 +11500,7 @@
     </w:p>
     <w:p ns2:paraId="1257DF64" ns2:textId="77777777">
       <w:pPr>
+        <w:pStyle w:val="Heading3"/>
         <w:spacing w:after="0" w:line="259" w:lineRule="auto"/>
         <w:ind w:left="-5" w:right="0"/>
         <w:jc w:val="left"/>
@@ -11391,6 +11537,7 @@
     </w:p>
     <w:p ns2:paraId="368509A4" ns2:textId="77777777">
       <w:pPr>
+        <w:pStyle w:val="Heading3"/>
         <w:spacing w:after="0" w:line="259" w:lineRule="auto"/>
         <w:ind w:left="-5" w:right="0"/>
         <w:jc w:val="left"/>
@@ -11426,6 +11573,7 @@
     </w:p>
     <w:p ns2:paraId="407001E6" ns2:textId="77777777">
       <w:pPr>
+        <w:pStyle w:val="Heading3"/>
         <w:spacing w:after="0" w:line="259" w:lineRule="auto"/>
         <w:ind w:left="-5" w:right="0"/>
         <w:jc w:val="left"/>
@@ -11463,6 +11611,7 @@
     </w:p>
     <w:p ns2:paraId="0B2531AA" ns2:textId="77777777">
       <w:pPr>
+        <w:pStyle w:val="Heading3"/>
         <w:spacing w:after="0" w:line="259" w:lineRule="auto"/>
         <w:ind w:left="-5" w:right="0"/>
         <w:jc w:val="left"/>
@@ -11975,7 +12124,16 @@
         <w:pStyle w:val="Normal"/>
       </w:pPr>
       <w:r>
-        <w:t xml:space="preserve">3. Receiver positions are sampled using coverage_test() to account for building geometry, then filtered to the 256 m bounding box.</w:t>
+        <w:t xml:space="preserve">3. Receiver positions are sampled using </w:t>
+      </w:r>
+      <w:r>
+        <w:rPr>
+          <w:b/>
+        </w:rPr>
+        <w:t xml:space="preserve">coverage_test()</w:t>
+      </w:r>
+      <w:r>
+        <w:t xml:space="preserve"> to account for building geometry, then filtered to the 256 m bounding box.</w:t>
       </w:r>
     </w:p>
     <w:p>
@@ -11983,7 +12141,16 @@
         <w:pStyle w:val="Normal"/>
       </w:pPr>
       <w:r>
-        <w:t xml:space="preserve">4. sigstrength() computes the received power at every sample point for each transmitter.</w:t>
+        <w:t xml:space="preserve">4. </w:t>
+      </w:r>
+      <w:r>
+        <w:rPr>
+          <w:b/>
+        </w:rPr>
+        <w:t xml:space="preserve">sigstrength()</w:t>
+      </w:r>
+      <w:r>
+        <w:t xml:space="preserve"> computes the received power at every sample point for each transmitter.</w:t>
       </w:r>
     </w:p>
     <w:p>

</xml_diff>